<commit_message>
revised dairy work quiz
Added complete translated sentences, removed TTS for Spanish text, improved highlighting of key words. Made the CSS and JS with new names and relative paths to the Dairy parent folder, to avoid changing other quiz actions dependent on old quiz.css and quiz.js. Updated the work scenarios printable file.
</commit_message>
<xml_diff>
--- a/General-Work/Dairy/work-vocab/dairy_quiz_printable.docx
+++ b/General-Work/Dairy/work-vocab/dairy_quiz_printable.docx
@@ -9,7 +9,6 @@
           <w:lang w:val="es-419"/>
         </w:rPr>
       </w:pPr>
-      <w:proofErr w:type="gramStart"/>
       <w:r>
         <w:rPr>
           <w:b/>
@@ -23,16 +22,7 @@
           <w:sz w:val="32"/>
           <w:lang w:val="es-419"/>
         </w:rPr>
-        <w:t xml:space="preserve">  Dairy</w:t>
-      </w:r>
-      <w:proofErr w:type="gramEnd"/>
-      <w:r>
-        <w:rPr>
-          <w:b/>
-          <w:sz w:val="32"/>
-          <w:lang w:val="es-419"/>
-        </w:rPr>
-        <w:t xml:space="preserve"> Farm </w:t>
+        <w:t xml:space="preserve">  Dairy Farm </w:t>
       </w:r>
       <w:proofErr w:type="spellStart"/>
       <w:r>
@@ -232,43 +222,7 @@
           <w:szCs w:val="24"/>
           <w:lang w:val="es-419"/>
         </w:rPr>
-        <w:t xml:space="preserve">a)  correr     </w:t>
-      </w:r>
-      <w:proofErr w:type="gramStart"/>
-      <w:r>
-        <w:rPr>
-          <w:sz w:val="24"/>
-          <w:szCs w:val="24"/>
-          <w:lang w:val="es-419"/>
-        </w:rPr>
-        <w:t>b)  poner</w:t>
-      </w:r>
-      <w:proofErr w:type="gramEnd"/>
-      <w:r>
-        <w:rPr>
-          <w:sz w:val="24"/>
-          <w:szCs w:val="24"/>
-          <w:lang w:val="es-419"/>
-        </w:rPr>
-        <w:t xml:space="preserve"> en marcha     c</w:t>
-      </w:r>
-      <w:proofErr w:type="gramStart"/>
-      <w:r>
-        <w:rPr>
-          <w:sz w:val="24"/>
-          <w:szCs w:val="24"/>
-          <w:lang w:val="es-419"/>
-        </w:rPr>
-        <w:t>)  subir</w:t>
-      </w:r>
-      <w:proofErr w:type="gramEnd"/>
-      <w:r>
-        <w:rPr>
-          <w:sz w:val="24"/>
-          <w:szCs w:val="24"/>
-          <w:lang w:val="es-419"/>
-        </w:rPr>
-        <w:t xml:space="preserve">   </w:t>
+        <w:t xml:space="preserve">a)  correr     b)  poner en marcha     c)  subir   </w:t>
       </w:r>
     </w:p>
     <w:p>
@@ -327,25 +281,7 @@
           <w:szCs w:val="24"/>
           <w:lang w:val="es-419"/>
         </w:rPr>
-        <w:t xml:space="preserve">a)  cargadora     </w:t>
-      </w:r>
-      <w:proofErr w:type="gramStart"/>
-      <w:r>
-        <w:rPr>
-          <w:sz w:val="24"/>
-          <w:szCs w:val="24"/>
-          <w:lang w:val="es-419"/>
-        </w:rPr>
-        <w:t>b)  empacadora</w:t>
-      </w:r>
-      <w:proofErr w:type="gramEnd"/>
-      <w:r>
-        <w:rPr>
-          <w:sz w:val="24"/>
-          <w:szCs w:val="24"/>
-          <w:lang w:val="es-419"/>
-        </w:rPr>
-        <w:t xml:space="preserve">     </w:t>
+        <w:t xml:space="preserve">a)  cargadora     b)  empacadora     </w:t>
       </w:r>
       <w:r>
         <w:rPr>
@@ -361,25 +297,7 @@
           <w:szCs w:val="24"/>
           <w:lang w:val="es-419"/>
         </w:rPr>
-        <w:t>c</w:t>
-      </w:r>
-      <w:proofErr w:type="gramStart"/>
-      <w:r>
-        <w:rPr>
-          <w:sz w:val="24"/>
-          <w:szCs w:val="24"/>
-          <w:lang w:val="es-419"/>
-        </w:rPr>
-        <w:t>)  raspador</w:t>
-      </w:r>
-      <w:proofErr w:type="gramEnd"/>
-      <w:r>
-        <w:rPr>
-          <w:sz w:val="24"/>
-          <w:szCs w:val="24"/>
-          <w:lang w:val="es-419"/>
-        </w:rPr>
-        <w:t xml:space="preserve"> de pasillos   </w:t>
+        <w:t xml:space="preserve">c)  raspador de pasillos   </w:t>
       </w:r>
     </w:p>
     <w:p>
@@ -445,43 +363,7 @@
           <w:szCs w:val="24"/>
           <w:lang w:val="es-419"/>
         </w:rPr>
-        <w:t xml:space="preserve">a)  lavar     </w:t>
-      </w:r>
-      <w:proofErr w:type="gramStart"/>
-      <w:r>
-        <w:rPr>
-          <w:sz w:val="24"/>
-          <w:szCs w:val="24"/>
-          <w:lang w:val="es-419"/>
-        </w:rPr>
-        <w:t>b)  arreglar</w:t>
-      </w:r>
-      <w:proofErr w:type="gramEnd"/>
-      <w:r>
-        <w:rPr>
-          <w:sz w:val="24"/>
-          <w:szCs w:val="24"/>
-          <w:lang w:val="es-419"/>
-        </w:rPr>
-        <w:t xml:space="preserve">     c</w:t>
-      </w:r>
-      <w:proofErr w:type="gramStart"/>
-      <w:r>
-        <w:rPr>
-          <w:sz w:val="24"/>
-          <w:szCs w:val="24"/>
-          <w:lang w:val="es-419"/>
-        </w:rPr>
-        <w:t>)  limpiar</w:t>
-      </w:r>
-      <w:proofErr w:type="gramEnd"/>
-      <w:r>
-        <w:rPr>
-          <w:sz w:val="24"/>
-          <w:szCs w:val="24"/>
-          <w:lang w:val="es-419"/>
-        </w:rPr>
-        <w:t xml:space="preserve">   </w:t>
+        <w:t xml:space="preserve">a)  lavar     b)  arreglar     c)  limpiar   </w:t>
       </w:r>
     </w:p>
     <w:p>
@@ -547,43 +429,7 @@
           <w:szCs w:val="24"/>
           <w:lang w:val="es-419"/>
         </w:rPr>
-        <w:t xml:space="preserve">a)  heno     </w:t>
-      </w:r>
-      <w:proofErr w:type="gramStart"/>
-      <w:r>
-        <w:rPr>
-          <w:sz w:val="24"/>
-          <w:szCs w:val="24"/>
-          <w:lang w:val="es-419"/>
-        </w:rPr>
-        <w:t>b)  arena</w:t>
-      </w:r>
-      <w:proofErr w:type="gramEnd"/>
-      <w:r>
-        <w:rPr>
-          <w:sz w:val="24"/>
-          <w:szCs w:val="24"/>
-          <w:lang w:val="es-419"/>
-        </w:rPr>
-        <w:t xml:space="preserve">     c</w:t>
-      </w:r>
-      <w:proofErr w:type="gramStart"/>
-      <w:r>
-        <w:rPr>
-          <w:sz w:val="24"/>
-          <w:szCs w:val="24"/>
-          <w:lang w:val="es-419"/>
-        </w:rPr>
-        <w:t>)  estiércol</w:t>
-      </w:r>
-      <w:proofErr w:type="gramEnd"/>
-      <w:r>
-        <w:rPr>
-          <w:sz w:val="24"/>
-          <w:szCs w:val="24"/>
-          <w:lang w:val="es-419"/>
-        </w:rPr>
-        <w:t xml:space="preserve">   </w:t>
+        <w:t xml:space="preserve">a)  heno     b)  arena     c)  estiércol   </w:t>
       </w:r>
     </w:p>
     <w:p>
@@ -649,43 +495,7 @@
           <w:szCs w:val="24"/>
           <w:lang w:val="es-419"/>
         </w:rPr>
-        <w:t xml:space="preserve">a)  corrales     </w:t>
-      </w:r>
-      <w:proofErr w:type="gramStart"/>
-      <w:r>
-        <w:rPr>
-          <w:sz w:val="24"/>
-          <w:szCs w:val="24"/>
-          <w:lang w:val="es-419"/>
-        </w:rPr>
-        <w:t>b)  pasillos</w:t>
-      </w:r>
-      <w:proofErr w:type="gramEnd"/>
-      <w:r>
-        <w:rPr>
-          <w:sz w:val="24"/>
-          <w:szCs w:val="24"/>
-          <w:lang w:val="es-419"/>
-        </w:rPr>
-        <w:t xml:space="preserve">     c</w:t>
-      </w:r>
-      <w:proofErr w:type="gramStart"/>
-      <w:r>
-        <w:rPr>
-          <w:sz w:val="24"/>
-          <w:szCs w:val="24"/>
-          <w:lang w:val="es-419"/>
-        </w:rPr>
-        <w:t>)  establos</w:t>
-      </w:r>
-      <w:proofErr w:type="gramEnd"/>
-      <w:r>
-        <w:rPr>
-          <w:sz w:val="24"/>
-          <w:szCs w:val="24"/>
-          <w:lang w:val="es-419"/>
-        </w:rPr>
-        <w:t xml:space="preserve">   </w:t>
+        <w:t xml:space="preserve">a)  corrales     b)  pasillos     c)  establos   </w:t>
       </w:r>
     </w:p>
     <w:p>
@@ -744,43 +554,7 @@
           <w:szCs w:val="24"/>
           <w:lang w:val="es-419"/>
         </w:rPr>
-        <w:t xml:space="preserve">a)  conectar     </w:t>
-      </w:r>
-      <w:proofErr w:type="gramStart"/>
-      <w:r>
-        <w:rPr>
-          <w:sz w:val="24"/>
-          <w:szCs w:val="24"/>
-          <w:lang w:val="es-419"/>
-        </w:rPr>
-        <w:t>b)  fijar</w:t>
-      </w:r>
-      <w:proofErr w:type="gramEnd"/>
-      <w:r>
-        <w:rPr>
-          <w:sz w:val="24"/>
-          <w:szCs w:val="24"/>
-          <w:lang w:val="es-419"/>
-        </w:rPr>
-        <w:t xml:space="preserve">     c</w:t>
-      </w:r>
-      <w:proofErr w:type="gramStart"/>
-      <w:r>
-        <w:rPr>
-          <w:sz w:val="24"/>
-          <w:szCs w:val="24"/>
-          <w:lang w:val="es-419"/>
-        </w:rPr>
-        <w:t>)  encender</w:t>
-      </w:r>
-      <w:proofErr w:type="gramEnd"/>
-      <w:r>
-        <w:rPr>
-          <w:sz w:val="24"/>
-          <w:szCs w:val="24"/>
-          <w:lang w:val="es-419"/>
-        </w:rPr>
-        <w:t xml:space="preserve">   </w:t>
+        <w:t xml:space="preserve">a)  conectar     b)  fijar     c)  encender   </w:t>
       </w:r>
     </w:p>
     <w:p>
@@ -846,43 +620,7 @@
           <w:szCs w:val="24"/>
           <w:lang w:val="es-419"/>
         </w:rPr>
-        <w:t xml:space="preserve">a)  cubeta     </w:t>
-      </w:r>
-      <w:proofErr w:type="gramStart"/>
-      <w:r>
-        <w:rPr>
-          <w:sz w:val="24"/>
-          <w:szCs w:val="24"/>
-          <w:lang w:val="es-419"/>
-        </w:rPr>
-        <w:t>b)  boquilla</w:t>
-      </w:r>
-      <w:proofErr w:type="gramEnd"/>
-      <w:r>
-        <w:rPr>
-          <w:sz w:val="24"/>
-          <w:szCs w:val="24"/>
-          <w:lang w:val="es-419"/>
-        </w:rPr>
-        <w:t xml:space="preserve">     c</w:t>
-      </w:r>
-      <w:proofErr w:type="gramStart"/>
-      <w:r>
-        <w:rPr>
-          <w:sz w:val="24"/>
-          <w:szCs w:val="24"/>
-          <w:lang w:val="es-419"/>
-        </w:rPr>
-        <w:t>)  manguera</w:t>
-      </w:r>
-      <w:proofErr w:type="gramEnd"/>
-      <w:r>
-        <w:rPr>
-          <w:sz w:val="24"/>
-          <w:szCs w:val="24"/>
-          <w:lang w:val="es-419"/>
-        </w:rPr>
-        <w:t xml:space="preserve">   </w:t>
+        <w:t xml:space="preserve">a)  cubeta     b)  boquilla     c)  manguera   </w:t>
       </w:r>
     </w:p>
     <w:p>
@@ -948,43 +686,7 @@
           <w:szCs w:val="24"/>
           <w:lang w:val="es-419"/>
         </w:rPr>
-        <w:t xml:space="preserve">a)  pasillo     </w:t>
-      </w:r>
-      <w:proofErr w:type="gramStart"/>
-      <w:r>
-        <w:rPr>
-          <w:sz w:val="24"/>
-          <w:szCs w:val="24"/>
-          <w:lang w:val="es-419"/>
-        </w:rPr>
-        <w:t>b)  basurero</w:t>
-      </w:r>
-      <w:proofErr w:type="gramEnd"/>
-      <w:r>
-        <w:rPr>
-          <w:sz w:val="24"/>
-          <w:szCs w:val="24"/>
-          <w:lang w:val="es-419"/>
-        </w:rPr>
-        <w:t xml:space="preserve">     c</w:t>
-      </w:r>
-      <w:proofErr w:type="gramStart"/>
-      <w:r>
-        <w:rPr>
-          <w:sz w:val="24"/>
-          <w:szCs w:val="24"/>
-          <w:lang w:val="es-419"/>
-        </w:rPr>
-        <w:t>)  grifo</w:t>
-      </w:r>
-      <w:proofErr w:type="gramEnd"/>
-      <w:r>
-        <w:rPr>
-          <w:sz w:val="24"/>
-          <w:szCs w:val="24"/>
-          <w:lang w:val="es-419"/>
-        </w:rPr>
-        <w:t xml:space="preserve">   </w:t>
+        <w:t xml:space="preserve">a)  pasillo     b)  basurero     c)  grifo   </w:t>
       </w:r>
     </w:p>
     <w:p>
@@ -1050,43 +752,7 @@
           <w:szCs w:val="24"/>
           <w:lang w:val="es-419"/>
         </w:rPr>
-        <w:t xml:space="preserve">a)  manguera     </w:t>
-      </w:r>
-      <w:proofErr w:type="gramStart"/>
-      <w:r>
-        <w:rPr>
-          <w:sz w:val="24"/>
-          <w:szCs w:val="24"/>
-          <w:lang w:val="es-419"/>
-        </w:rPr>
-        <w:t>b)  cuerda</w:t>
-      </w:r>
-      <w:proofErr w:type="gramEnd"/>
-      <w:r>
-        <w:rPr>
-          <w:sz w:val="24"/>
-          <w:szCs w:val="24"/>
-          <w:lang w:val="es-419"/>
-        </w:rPr>
-        <w:t xml:space="preserve">     c</w:t>
-      </w:r>
-      <w:proofErr w:type="gramStart"/>
-      <w:r>
-        <w:rPr>
-          <w:sz w:val="24"/>
-          <w:szCs w:val="24"/>
-          <w:lang w:val="es-419"/>
-        </w:rPr>
-        <w:t>)  boquilla</w:t>
-      </w:r>
-      <w:proofErr w:type="gramEnd"/>
-      <w:r>
-        <w:rPr>
-          <w:sz w:val="24"/>
-          <w:szCs w:val="24"/>
-          <w:lang w:val="es-419"/>
-        </w:rPr>
-        <w:t xml:space="preserve">   </w:t>
+        <w:t xml:space="preserve">a)  manguera     b)  cuerda     c)  boquilla   </w:t>
       </w:r>
     </w:p>
     <w:p>
@@ -1145,43 +811,7 @@
           <w:szCs w:val="24"/>
           <w:lang w:val="es-419"/>
         </w:rPr>
-        <w:t xml:space="preserve">a)  limpiar     </w:t>
-      </w:r>
-      <w:proofErr w:type="gramStart"/>
-      <w:r>
-        <w:rPr>
-          <w:sz w:val="24"/>
-          <w:szCs w:val="24"/>
-          <w:lang w:val="es-419"/>
-        </w:rPr>
-        <w:t>b)  lavar</w:t>
-      </w:r>
-      <w:proofErr w:type="gramEnd"/>
-      <w:r>
-        <w:rPr>
-          <w:sz w:val="24"/>
-          <w:szCs w:val="24"/>
-          <w:lang w:val="es-419"/>
-        </w:rPr>
-        <w:t xml:space="preserve">     c</w:t>
-      </w:r>
-      <w:proofErr w:type="gramStart"/>
-      <w:r>
-        <w:rPr>
-          <w:sz w:val="24"/>
-          <w:szCs w:val="24"/>
-          <w:lang w:val="es-419"/>
-        </w:rPr>
-        <w:t>)  rociar</w:t>
-      </w:r>
-      <w:proofErr w:type="gramEnd"/>
-      <w:r>
-        <w:rPr>
-          <w:sz w:val="24"/>
-          <w:szCs w:val="24"/>
-          <w:lang w:val="es-419"/>
-        </w:rPr>
-        <w:t xml:space="preserve">   </w:t>
+        <w:t xml:space="preserve">a)  limpiar     b)  lavar     c)  rociar   </w:t>
       </w:r>
     </w:p>
     <w:p>
@@ -1247,43 +877,7 @@
           <w:szCs w:val="24"/>
           <w:lang w:val="es-419"/>
         </w:rPr>
-        <w:t xml:space="preserve">a)  pasillo     </w:t>
-      </w:r>
-      <w:proofErr w:type="gramStart"/>
-      <w:r>
-        <w:rPr>
-          <w:sz w:val="24"/>
-          <w:szCs w:val="24"/>
-          <w:lang w:val="es-419"/>
-        </w:rPr>
-        <w:t>b)  corral</w:t>
-      </w:r>
-      <w:proofErr w:type="gramEnd"/>
-      <w:r>
-        <w:rPr>
-          <w:sz w:val="24"/>
-          <w:szCs w:val="24"/>
-          <w:lang w:val="es-419"/>
-        </w:rPr>
-        <w:t xml:space="preserve">     c</w:t>
-      </w:r>
-      <w:proofErr w:type="gramStart"/>
-      <w:r>
-        <w:rPr>
-          <w:sz w:val="24"/>
-          <w:szCs w:val="24"/>
-          <w:lang w:val="es-419"/>
-        </w:rPr>
-        <w:t>)  establo</w:t>
-      </w:r>
-      <w:proofErr w:type="gramEnd"/>
-      <w:r>
-        <w:rPr>
-          <w:sz w:val="24"/>
-          <w:szCs w:val="24"/>
-          <w:lang w:val="es-419"/>
-        </w:rPr>
-        <w:t xml:space="preserve">   </w:t>
+        <w:t xml:space="preserve">a)  pasillo     b)  corral     c)  establo   </w:t>
       </w:r>
     </w:p>
     <w:p>
@@ -1349,43 +943,7 @@
           <w:szCs w:val="24"/>
           <w:lang w:val="es-419"/>
         </w:rPr>
-        <w:t xml:space="preserve">a)  el turno     </w:t>
-      </w:r>
-      <w:proofErr w:type="gramStart"/>
-      <w:r>
-        <w:rPr>
-          <w:sz w:val="24"/>
-          <w:szCs w:val="24"/>
-          <w:lang w:val="es-419"/>
-        </w:rPr>
-        <w:t>b)  la</w:t>
-      </w:r>
-      <w:proofErr w:type="gramEnd"/>
-      <w:r>
-        <w:rPr>
-          <w:sz w:val="24"/>
-          <w:szCs w:val="24"/>
-          <w:lang w:val="es-419"/>
-        </w:rPr>
-        <w:t xml:space="preserve"> cosecha     c</w:t>
-      </w:r>
-      <w:proofErr w:type="gramStart"/>
-      <w:r>
-        <w:rPr>
-          <w:sz w:val="24"/>
-          <w:szCs w:val="24"/>
-          <w:lang w:val="es-419"/>
-        </w:rPr>
-        <w:t>)  el</w:t>
-      </w:r>
-      <w:proofErr w:type="gramEnd"/>
-      <w:r>
-        <w:rPr>
-          <w:sz w:val="24"/>
-          <w:szCs w:val="24"/>
-          <w:lang w:val="es-419"/>
-        </w:rPr>
-        <w:t xml:space="preserve"> ordeño   </w:t>
+        <w:t xml:space="preserve">a)  el turno     b)  la cosecha     c)  el ordeño   </w:t>
       </w:r>
     </w:p>
     <w:p>
@@ -1444,43 +1002,7 @@
           <w:szCs w:val="24"/>
           <w:lang w:val="es-419"/>
         </w:rPr>
-        <w:t xml:space="preserve">a)  tirar     </w:t>
-      </w:r>
-      <w:proofErr w:type="gramStart"/>
-      <w:r>
-        <w:rPr>
-          <w:sz w:val="24"/>
-          <w:szCs w:val="24"/>
-          <w:lang w:val="es-419"/>
-        </w:rPr>
-        <w:t>b)  limpiar</w:t>
-      </w:r>
-      <w:proofErr w:type="gramEnd"/>
-      <w:r>
-        <w:rPr>
-          <w:sz w:val="24"/>
-          <w:szCs w:val="24"/>
-          <w:lang w:val="es-419"/>
-        </w:rPr>
-        <w:t xml:space="preserve">     c</w:t>
-      </w:r>
-      <w:proofErr w:type="gramStart"/>
-      <w:r>
-        <w:rPr>
-          <w:sz w:val="24"/>
-          <w:szCs w:val="24"/>
-          <w:lang w:val="es-419"/>
-        </w:rPr>
-        <w:t>)  poner</w:t>
-      </w:r>
-      <w:proofErr w:type="gramEnd"/>
-      <w:r>
-        <w:rPr>
-          <w:sz w:val="24"/>
-          <w:szCs w:val="24"/>
-          <w:lang w:val="es-419"/>
-        </w:rPr>
-        <w:t xml:space="preserve">   </w:t>
+        <w:t xml:space="preserve">a)  tirar     b)  limpiar     c)  poner   </w:t>
       </w:r>
     </w:p>
     <w:p>
@@ -1546,43 +1068,7 @@
           <w:szCs w:val="24"/>
           <w:lang w:val="es-419"/>
         </w:rPr>
-        <w:t xml:space="preserve">a)  cubetas     </w:t>
-      </w:r>
-      <w:proofErr w:type="gramStart"/>
-      <w:r>
-        <w:rPr>
-          <w:sz w:val="24"/>
-          <w:szCs w:val="24"/>
-          <w:lang w:val="es-419"/>
-        </w:rPr>
-        <w:t>b)  mangueras</w:t>
-      </w:r>
-      <w:proofErr w:type="gramEnd"/>
-      <w:r>
-        <w:rPr>
-          <w:sz w:val="24"/>
-          <w:szCs w:val="24"/>
-          <w:lang w:val="es-419"/>
-        </w:rPr>
-        <w:t xml:space="preserve">     c</w:t>
-      </w:r>
-      <w:proofErr w:type="gramStart"/>
-      <w:r>
-        <w:rPr>
-          <w:sz w:val="24"/>
-          <w:szCs w:val="24"/>
-          <w:lang w:val="es-419"/>
-        </w:rPr>
-        <w:t>)  bolsas</w:t>
-      </w:r>
-      <w:proofErr w:type="gramEnd"/>
-      <w:r>
-        <w:rPr>
-          <w:sz w:val="24"/>
-          <w:szCs w:val="24"/>
-          <w:lang w:val="es-419"/>
-        </w:rPr>
-        <w:t xml:space="preserve"> de basura   </w:t>
+        <w:t xml:space="preserve">a)  cubetas     b)  mangueras     c)  bolsas de basura   </w:t>
       </w:r>
     </w:p>
     <w:p>
@@ -1648,43 +1134,7 @@
           <w:szCs w:val="24"/>
           <w:lang w:val="es-419"/>
         </w:rPr>
-        <w:t xml:space="preserve">a)  basurero     </w:t>
-      </w:r>
-      <w:proofErr w:type="gramStart"/>
-      <w:r>
-        <w:rPr>
-          <w:sz w:val="24"/>
-          <w:szCs w:val="24"/>
-          <w:lang w:val="es-419"/>
-        </w:rPr>
-        <w:t>b)  corral</w:t>
-      </w:r>
-      <w:proofErr w:type="gramEnd"/>
-      <w:r>
-        <w:rPr>
-          <w:sz w:val="24"/>
-          <w:szCs w:val="24"/>
-          <w:lang w:val="es-419"/>
-        </w:rPr>
-        <w:t xml:space="preserve">     c</w:t>
-      </w:r>
-      <w:proofErr w:type="gramStart"/>
-      <w:r>
-        <w:rPr>
-          <w:sz w:val="24"/>
-          <w:szCs w:val="24"/>
-          <w:lang w:val="es-419"/>
-        </w:rPr>
-        <w:t>)  establo</w:t>
-      </w:r>
-      <w:proofErr w:type="gramEnd"/>
-      <w:r>
-        <w:rPr>
-          <w:sz w:val="24"/>
-          <w:szCs w:val="24"/>
-          <w:lang w:val="es-419"/>
-        </w:rPr>
-        <w:t xml:space="preserve">   </w:t>
+        <w:t xml:space="preserve">a)  basurero     b)  corral     c)  establo   </w:t>
       </w:r>
     </w:p>
     <w:p>
@@ -1750,43 +1200,7 @@
           <w:szCs w:val="24"/>
           <w:lang w:val="es-419"/>
         </w:rPr>
-        <w:t xml:space="preserve">a)  cubeta     </w:t>
-      </w:r>
-      <w:proofErr w:type="gramStart"/>
-      <w:r>
-        <w:rPr>
-          <w:sz w:val="24"/>
-          <w:szCs w:val="24"/>
-          <w:lang w:val="es-419"/>
-        </w:rPr>
-        <w:t>b)  manguera</w:t>
-      </w:r>
-      <w:proofErr w:type="gramEnd"/>
-      <w:r>
-        <w:rPr>
-          <w:sz w:val="24"/>
-          <w:szCs w:val="24"/>
-          <w:lang w:val="es-419"/>
-        </w:rPr>
-        <w:t xml:space="preserve">     c</w:t>
-      </w:r>
-      <w:proofErr w:type="gramStart"/>
-      <w:r>
-        <w:rPr>
-          <w:sz w:val="24"/>
-          <w:szCs w:val="24"/>
-          <w:lang w:val="es-419"/>
-        </w:rPr>
-        <w:t>)  pala</w:t>
-      </w:r>
-      <w:proofErr w:type="gramEnd"/>
-      <w:r>
-        <w:rPr>
-          <w:sz w:val="24"/>
-          <w:szCs w:val="24"/>
-          <w:lang w:val="es-419"/>
-        </w:rPr>
-        <w:t xml:space="preserve">   </w:t>
+        <w:t xml:space="preserve">a)  cubeta     b)  manguera     c)  pala   </w:t>
       </w:r>
     </w:p>
     <w:p>
@@ -1852,43 +1266,7 @@
           <w:szCs w:val="24"/>
           <w:lang w:val="es-419"/>
         </w:rPr>
-        <w:t xml:space="preserve">a)  lavar     </w:t>
-      </w:r>
-      <w:proofErr w:type="gramStart"/>
-      <w:r>
-        <w:rPr>
-          <w:sz w:val="24"/>
-          <w:szCs w:val="24"/>
-          <w:lang w:val="es-419"/>
-        </w:rPr>
-        <w:t>b)  raspar</w:t>
-      </w:r>
-      <w:proofErr w:type="gramEnd"/>
-      <w:r>
-        <w:rPr>
-          <w:sz w:val="24"/>
-          <w:szCs w:val="24"/>
-          <w:lang w:val="es-419"/>
-        </w:rPr>
-        <w:t xml:space="preserve">     c</w:t>
-      </w:r>
-      <w:proofErr w:type="gramStart"/>
-      <w:r>
-        <w:rPr>
-          <w:sz w:val="24"/>
-          <w:szCs w:val="24"/>
-          <w:lang w:val="es-419"/>
-        </w:rPr>
-        <w:t>)  limpiar</w:t>
-      </w:r>
-      <w:proofErr w:type="gramEnd"/>
-      <w:r>
-        <w:rPr>
-          <w:sz w:val="24"/>
-          <w:szCs w:val="24"/>
-          <w:lang w:val="es-419"/>
-        </w:rPr>
-        <w:t xml:space="preserve">   </w:t>
+        <w:t xml:space="preserve">a)  lavar     b)  raspar     c)  limpiar   </w:t>
       </w:r>
     </w:p>
     <w:p>
@@ -1954,43 +1332,7 @@
           <w:szCs w:val="24"/>
           <w:lang w:val="es-419"/>
         </w:rPr>
-        <w:t xml:space="preserve">a)  estiércol     </w:t>
-      </w:r>
-      <w:proofErr w:type="gramStart"/>
-      <w:r>
-        <w:rPr>
-          <w:sz w:val="24"/>
-          <w:szCs w:val="24"/>
-          <w:lang w:val="es-419"/>
-        </w:rPr>
-        <w:t>b)  leche</w:t>
-      </w:r>
-      <w:proofErr w:type="gramEnd"/>
-      <w:r>
-        <w:rPr>
-          <w:sz w:val="24"/>
-          <w:szCs w:val="24"/>
-          <w:lang w:val="es-419"/>
-        </w:rPr>
-        <w:t xml:space="preserve">     c</w:t>
-      </w:r>
-      <w:proofErr w:type="gramStart"/>
-      <w:r>
-        <w:rPr>
-          <w:sz w:val="24"/>
-          <w:szCs w:val="24"/>
-          <w:lang w:val="es-419"/>
-        </w:rPr>
-        <w:t>)  agua</w:t>
-      </w:r>
-      <w:proofErr w:type="gramEnd"/>
-      <w:r>
-        <w:rPr>
-          <w:sz w:val="24"/>
-          <w:szCs w:val="24"/>
-          <w:lang w:val="es-419"/>
-        </w:rPr>
-        <w:t xml:space="preserve">   </w:t>
+        <w:t xml:space="preserve">a)  estiércol     b)  leche     c)  agua   </w:t>
       </w:r>
     </w:p>
     <w:p>
@@ -2183,25 +1525,7 @@
           <w:szCs w:val="24"/>
           <w:lang w:val="es-419"/>
         </w:rPr>
-        <w:t xml:space="preserve">a)  conectar     </w:t>
-      </w:r>
-      <w:proofErr w:type="gramStart"/>
-      <w:r>
-        <w:rPr>
-          <w:sz w:val="24"/>
-          <w:szCs w:val="24"/>
-          <w:lang w:val="es-419"/>
-        </w:rPr>
-        <w:t>b)  poner</w:t>
-      </w:r>
-      <w:proofErr w:type="gramEnd"/>
-      <w:r>
-        <w:rPr>
-          <w:sz w:val="24"/>
-          <w:szCs w:val="24"/>
-          <w:lang w:val="es-419"/>
-        </w:rPr>
-        <w:t xml:space="preserve"> en marcha     </w:t>
+        <w:t xml:space="preserve">a)  conectar     b)  poner en marcha     </w:t>
       </w:r>
       <w:r>
         <w:rPr>
@@ -2217,25 +1541,7 @@
           <w:szCs w:val="24"/>
           <w:lang w:val="es-419"/>
         </w:rPr>
-        <w:t>c</w:t>
-      </w:r>
-      <w:proofErr w:type="gramStart"/>
-      <w:r>
-        <w:rPr>
-          <w:sz w:val="24"/>
-          <w:szCs w:val="24"/>
-          <w:lang w:val="es-419"/>
-        </w:rPr>
-        <w:t>)  encender</w:t>
-      </w:r>
-      <w:proofErr w:type="gramEnd"/>
-      <w:r>
-        <w:rPr>
-          <w:sz w:val="24"/>
-          <w:szCs w:val="24"/>
-          <w:lang w:val="es-419"/>
-        </w:rPr>
-        <w:t xml:space="preserve">   </w:t>
+        <w:t xml:space="preserve">c)  encender   </w:t>
       </w:r>
     </w:p>
     <w:p>
@@ -2301,43 +1607,7 @@
           <w:szCs w:val="24"/>
           <w:lang w:val="es-419"/>
         </w:rPr>
-        <w:t xml:space="preserve">a)  picadora     </w:t>
-      </w:r>
-      <w:proofErr w:type="gramStart"/>
-      <w:r>
-        <w:rPr>
-          <w:sz w:val="24"/>
-          <w:szCs w:val="24"/>
-          <w:lang w:val="es-419"/>
-        </w:rPr>
-        <w:t>b)  cargadora</w:t>
-      </w:r>
-      <w:proofErr w:type="gramEnd"/>
-      <w:r>
-        <w:rPr>
-          <w:sz w:val="24"/>
-          <w:szCs w:val="24"/>
-          <w:lang w:val="es-419"/>
-        </w:rPr>
-        <w:t xml:space="preserve">     c</w:t>
-      </w:r>
-      <w:proofErr w:type="gramStart"/>
-      <w:r>
-        <w:rPr>
-          <w:sz w:val="24"/>
-          <w:szCs w:val="24"/>
-          <w:lang w:val="es-419"/>
-        </w:rPr>
-        <w:t>)  mezcladora</w:t>
-      </w:r>
-      <w:proofErr w:type="gramEnd"/>
-      <w:r>
-        <w:rPr>
-          <w:sz w:val="24"/>
-          <w:szCs w:val="24"/>
-          <w:lang w:val="es-419"/>
-        </w:rPr>
-        <w:t xml:space="preserve">   </w:t>
+        <w:t xml:space="preserve">a)  picadora     b)  cargadora     c)  mezcladora   </w:t>
       </w:r>
     </w:p>
     <w:p>
@@ -2396,43 +1666,7 @@
           <w:szCs w:val="24"/>
           <w:lang w:val="es-419"/>
         </w:rPr>
-        <w:t xml:space="preserve">a)  cortar     </w:t>
-      </w:r>
-      <w:proofErr w:type="gramStart"/>
-      <w:r>
-        <w:rPr>
-          <w:sz w:val="24"/>
-          <w:szCs w:val="24"/>
-          <w:lang w:val="es-419"/>
-        </w:rPr>
-        <w:t>b)  apretar</w:t>
-      </w:r>
-      <w:proofErr w:type="gramEnd"/>
-      <w:r>
-        <w:rPr>
-          <w:sz w:val="24"/>
-          <w:szCs w:val="24"/>
-          <w:lang w:val="es-419"/>
-        </w:rPr>
-        <w:t xml:space="preserve">     c</w:t>
-      </w:r>
-      <w:proofErr w:type="gramStart"/>
-      <w:r>
-        <w:rPr>
-          <w:sz w:val="24"/>
-          <w:szCs w:val="24"/>
-          <w:lang w:val="es-419"/>
-        </w:rPr>
-        <w:t>)  doblar</w:t>
-      </w:r>
-      <w:proofErr w:type="gramEnd"/>
-      <w:r>
-        <w:rPr>
-          <w:sz w:val="24"/>
-          <w:szCs w:val="24"/>
-          <w:lang w:val="es-419"/>
-        </w:rPr>
-        <w:t xml:space="preserve">   </w:t>
+        <w:t xml:space="preserve">a)  cortar     b)  apretar     c)  doblar   </w:t>
       </w:r>
     </w:p>
     <w:p>
@@ -2498,43 +1732,7 @@
           <w:szCs w:val="24"/>
           <w:lang w:val="es-419"/>
         </w:rPr>
-        <w:t xml:space="preserve">a)  cadena     </w:t>
-      </w:r>
-      <w:proofErr w:type="gramStart"/>
-      <w:r>
-        <w:rPr>
-          <w:sz w:val="24"/>
-          <w:szCs w:val="24"/>
-          <w:lang w:val="es-419"/>
-        </w:rPr>
-        <w:t>b)  alambre</w:t>
-      </w:r>
-      <w:proofErr w:type="gramEnd"/>
-      <w:r>
-        <w:rPr>
-          <w:sz w:val="24"/>
-          <w:szCs w:val="24"/>
-          <w:lang w:val="es-419"/>
-        </w:rPr>
-        <w:t xml:space="preserve">     c</w:t>
-      </w:r>
-      <w:proofErr w:type="gramStart"/>
-      <w:r>
-        <w:rPr>
-          <w:sz w:val="24"/>
-          <w:szCs w:val="24"/>
-          <w:lang w:val="es-419"/>
-        </w:rPr>
-        <w:t>)  cuerda</w:t>
-      </w:r>
-      <w:proofErr w:type="gramEnd"/>
-      <w:r>
-        <w:rPr>
-          <w:sz w:val="24"/>
-          <w:szCs w:val="24"/>
-          <w:lang w:val="es-419"/>
-        </w:rPr>
-        <w:t xml:space="preserve">   </w:t>
+        <w:t xml:space="preserve">a)  cadena     b)  alambre     c)  cuerda   </w:t>
       </w:r>
     </w:p>
     <w:p>
@@ -2600,43 +1798,7 @@
           <w:szCs w:val="24"/>
           <w:lang w:val="es-419"/>
         </w:rPr>
-        <w:t xml:space="preserve">a)  comedero     </w:t>
-      </w:r>
-      <w:proofErr w:type="gramStart"/>
-      <w:r>
-        <w:rPr>
-          <w:sz w:val="24"/>
-          <w:szCs w:val="24"/>
-          <w:lang w:val="es-419"/>
-        </w:rPr>
-        <w:t>b)  paca</w:t>
-      </w:r>
-      <w:proofErr w:type="gramEnd"/>
-      <w:r>
-        <w:rPr>
-          <w:sz w:val="24"/>
-          <w:szCs w:val="24"/>
-          <w:lang w:val="es-419"/>
-        </w:rPr>
-        <w:t xml:space="preserve">     c</w:t>
-      </w:r>
-      <w:proofErr w:type="gramStart"/>
-      <w:r>
-        <w:rPr>
-          <w:sz w:val="24"/>
-          <w:szCs w:val="24"/>
-          <w:lang w:val="es-419"/>
-        </w:rPr>
-        <w:t>)  remolque</w:t>
-      </w:r>
-      <w:proofErr w:type="gramEnd"/>
-      <w:r>
-        <w:rPr>
-          <w:sz w:val="24"/>
-          <w:szCs w:val="24"/>
-          <w:lang w:val="es-419"/>
-        </w:rPr>
-        <w:t xml:space="preserve">   </w:t>
+        <w:t xml:space="preserve">a)  comedero     b)  paca     c)  remolque   </w:t>
       </w:r>
     </w:p>
     <w:p>
@@ -2702,43 +1864,7 @@
           <w:szCs w:val="24"/>
           <w:lang w:val="es-419"/>
         </w:rPr>
-        <w:t xml:space="preserve">a)  arreglar     </w:t>
-      </w:r>
-      <w:proofErr w:type="gramStart"/>
-      <w:r>
-        <w:rPr>
-          <w:sz w:val="24"/>
-          <w:szCs w:val="24"/>
-          <w:lang w:val="es-419"/>
-        </w:rPr>
-        <w:t>b)  poner</w:t>
-      </w:r>
-      <w:proofErr w:type="gramEnd"/>
-      <w:r>
-        <w:rPr>
-          <w:sz w:val="24"/>
-          <w:szCs w:val="24"/>
-          <w:lang w:val="es-419"/>
-        </w:rPr>
-        <w:t xml:space="preserve">     c</w:t>
-      </w:r>
-      <w:proofErr w:type="gramStart"/>
-      <w:r>
-        <w:rPr>
-          <w:sz w:val="24"/>
-          <w:szCs w:val="24"/>
-          <w:lang w:val="es-419"/>
-        </w:rPr>
-        <w:t>)  lavar</w:t>
-      </w:r>
-      <w:proofErr w:type="gramEnd"/>
-      <w:r>
-        <w:rPr>
-          <w:sz w:val="24"/>
-          <w:szCs w:val="24"/>
-          <w:lang w:val="es-419"/>
-        </w:rPr>
-        <w:t xml:space="preserve">   </w:t>
+        <w:t xml:space="preserve">a)  arreglar     b)  poner     c)  lavar   </w:t>
       </w:r>
     </w:p>
     <w:p>
@@ -2796,45 +1922,16 @@
         <w:rPr>
           <w:sz w:val="24"/>
           <w:szCs w:val="24"/>
-          <w:lang w:val="es-419"/>
-        </w:rPr>
-        <w:t xml:space="preserve">  a)  alimento     </w:t>
-      </w:r>
-      <w:proofErr w:type="gramStart"/>
-      <w:r>
-        <w:rPr>
-          <w:sz w:val="24"/>
-          <w:szCs w:val="24"/>
-          <w:lang w:val="es-419"/>
-        </w:rPr>
-        <w:t>b)  agua</w:t>
-      </w:r>
-      <w:proofErr w:type="gramEnd"/>
-      <w:r>
-        <w:rPr>
-          <w:sz w:val="24"/>
-          <w:szCs w:val="24"/>
-          <w:lang w:val="es-419"/>
-        </w:rPr>
-        <w:t xml:space="preserve">     c</w:t>
-      </w:r>
-      <w:proofErr w:type="gramStart"/>
-      <w:r>
-        <w:rPr>
-          <w:sz w:val="24"/>
-          <w:szCs w:val="24"/>
-          <w:lang w:val="es-419"/>
-        </w:rPr>
-        <w:t>)  ensilaje</w:t>
-      </w:r>
-      <w:proofErr w:type="gramEnd"/>
-      <w:r>
-        <w:rPr>
-          <w:sz w:val="24"/>
-          <w:szCs w:val="24"/>
-          <w:lang w:val="es-419"/>
-        </w:rPr>
-        <w:t xml:space="preserve">   </w:t>
+        </w:rPr>
+        <w:t xml:space="preserve">  </w:t>
+      </w:r>
+      <w:r>
+        <w:rPr>
+          <w:sz w:val="24"/>
+          <w:szCs w:val="24"/>
+          <w:lang w:val="es-419"/>
+        </w:rPr>
+        <w:t xml:space="preserve">a)  alimento     b)  agua     c)  ensilaje   </w:t>
       </w:r>
     </w:p>
     <w:p>
@@ -2843,7 +1940,6 @@
         <w:rPr>
           <w:sz w:val="24"/>
           <w:szCs w:val="24"/>
-          <w:lang w:val="es-419"/>
         </w:rPr>
       </w:pPr>
       <w:r>
@@ -2901,43 +1997,7 @@
           <w:szCs w:val="24"/>
           <w:lang w:val="es-419"/>
         </w:rPr>
-        <w:t xml:space="preserve">a)  comedero     </w:t>
-      </w:r>
-      <w:proofErr w:type="gramStart"/>
-      <w:r>
-        <w:rPr>
-          <w:sz w:val="24"/>
-          <w:szCs w:val="24"/>
-          <w:lang w:val="es-419"/>
-        </w:rPr>
-        <w:t>b)  pasillo</w:t>
-      </w:r>
-      <w:proofErr w:type="gramEnd"/>
-      <w:r>
-        <w:rPr>
-          <w:sz w:val="24"/>
-          <w:szCs w:val="24"/>
-          <w:lang w:val="es-419"/>
-        </w:rPr>
-        <w:t xml:space="preserve">     c</w:t>
-      </w:r>
-      <w:proofErr w:type="gramStart"/>
-      <w:r>
-        <w:rPr>
-          <w:sz w:val="24"/>
-          <w:szCs w:val="24"/>
-          <w:lang w:val="es-419"/>
-        </w:rPr>
-        <w:t>)  establo</w:t>
-      </w:r>
-      <w:proofErr w:type="gramEnd"/>
-      <w:r>
-        <w:rPr>
-          <w:sz w:val="24"/>
-          <w:szCs w:val="24"/>
-          <w:lang w:val="es-419"/>
-        </w:rPr>
-        <w:t xml:space="preserve">   </w:t>
+        <w:t xml:space="preserve">a)  comedero     b)  pasillo     c)  establo   </w:t>
       </w:r>
     </w:p>
     <w:p>
@@ -2996,43 +2056,7 @@
           <w:szCs w:val="24"/>
           <w:lang w:val="es-419"/>
         </w:rPr>
-        <w:t xml:space="preserve">a)  poner     </w:t>
-      </w:r>
-      <w:proofErr w:type="gramStart"/>
-      <w:r>
-        <w:rPr>
-          <w:sz w:val="24"/>
-          <w:szCs w:val="24"/>
-          <w:lang w:val="es-419"/>
-        </w:rPr>
-        <w:t>b)  dar</w:t>
-      </w:r>
-      <w:proofErr w:type="gramEnd"/>
-      <w:r>
-        <w:rPr>
-          <w:sz w:val="24"/>
-          <w:szCs w:val="24"/>
-          <w:lang w:val="es-419"/>
-        </w:rPr>
-        <w:t xml:space="preserve">     c</w:t>
-      </w:r>
-      <w:proofErr w:type="gramStart"/>
-      <w:r>
-        <w:rPr>
-          <w:sz w:val="24"/>
-          <w:szCs w:val="24"/>
-          <w:lang w:val="es-419"/>
-        </w:rPr>
-        <w:t>)  subir</w:t>
-      </w:r>
-      <w:proofErr w:type="gramEnd"/>
-      <w:r>
-        <w:rPr>
-          <w:sz w:val="24"/>
-          <w:szCs w:val="24"/>
-          <w:lang w:val="es-419"/>
-        </w:rPr>
-        <w:t xml:space="preserve">   </w:t>
+        <w:t xml:space="preserve">a)  poner     b)  dar     c)  subir   </w:t>
       </w:r>
     </w:p>
     <w:p>
@@ -3098,43 +2122,7 @@
           <w:szCs w:val="24"/>
           <w:lang w:val="es-419"/>
         </w:rPr>
-        <w:t xml:space="preserve">a)  leche     </w:t>
-      </w:r>
-      <w:proofErr w:type="gramStart"/>
-      <w:r>
-        <w:rPr>
-          <w:sz w:val="24"/>
-          <w:szCs w:val="24"/>
-          <w:lang w:val="es-419"/>
-        </w:rPr>
-        <w:t>b)  agua</w:t>
-      </w:r>
-      <w:proofErr w:type="gramEnd"/>
-      <w:r>
-        <w:rPr>
-          <w:sz w:val="24"/>
-          <w:szCs w:val="24"/>
-          <w:lang w:val="es-419"/>
-        </w:rPr>
-        <w:t xml:space="preserve">     c</w:t>
-      </w:r>
-      <w:proofErr w:type="gramStart"/>
-      <w:r>
-        <w:rPr>
-          <w:sz w:val="24"/>
-          <w:szCs w:val="24"/>
-          <w:lang w:val="es-419"/>
-        </w:rPr>
-        <w:t>)  alimento</w:t>
-      </w:r>
-      <w:proofErr w:type="gramEnd"/>
-      <w:r>
-        <w:rPr>
-          <w:sz w:val="24"/>
-          <w:szCs w:val="24"/>
-          <w:lang w:val="es-419"/>
-        </w:rPr>
-        <w:t xml:space="preserve">   </w:t>
+        <w:t xml:space="preserve">a)  leche     b)  agua     c)  alimento   </w:t>
       </w:r>
     </w:p>
     <w:p>
@@ -3193,25 +2181,7 @@
           <w:szCs w:val="24"/>
           <w:lang w:val="es-419"/>
         </w:rPr>
-        <w:t xml:space="preserve">a)  tractor     </w:t>
-      </w:r>
-      <w:proofErr w:type="gramStart"/>
-      <w:r>
-        <w:rPr>
-          <w:sz w:val="24"/>
-          <w:szCs w:val="24"/>
-          <w:lang w:val="es-419"/>
-        </w:rPr>
-        <w:t>b)  remolque</w:t>
-      </w:r>
-      <w:proofErr w:type="gramEnd"/>
-      <w:r>
-        <w:rPr>
-          <w:sz w:val="24"/>
-          <w:szCs w:val="24"/>
-          <w:lang w:val="es-419"/>
-        </w:rPr>
-        <w:t xml:space="preserve">     </w:t>
+        <w:t xml:space="preserve">a)  tractor     b)  remolque     </w:t>
       </w:r>
       <w:r>
         <w:rPr>
@@ -3227,25 +2197,7 @@
           <w:szCs w:val="24"/>
           <w:lang w:val="es-419"/>
         </w:rPr>
-        <w:t>c</w:t>
-      </w:r>
-      <w:proofErr w:type="gramStart"/>
-      <w:r>
-        <w:rPr>
-          <w:sz w:val="24"/>
-          <w:szCs w:val="24"/>
-          <w:lang w:val="es-419"/>
-        </w:rPr>
-        <w:t>)  camión</w:t>
-      </w:r>
-      <w:proofErr w:type="gramEnd"/>
-      <w:r>
-        <w:rPr>
-          <w:sz w:val="24"/>
-          <w:szCs w:val="24"/>
-          <w:lang w:val="es-419"/>
-        </w:rPr>
-        <w:t xml:space="preserve"> de carga   </w:t>
+        <w:t xml:space="preserve">c)  camión de carga   </w:t>
       </w:r>
     </w:p>
     <w:p>
@@ -3311,43 +2263,7 @@
           <w:szCs w:val="24"/>
           <w:lang w:val="es-419"/>
         </w:rPr>
-        <w:t xml:space="preserve">a)  poner     </w:t>
-      </w:r>
-      <w:proofErr w:type="gramStart"/>
-      <w:r>
-        <w:rPr>
-          <w:sz w:val="24"/>
-          <w:szCs w:val="24"/>
-          <w:lang w:val="es-419"/>
-        </w:rPr>
-        <w:t>b)  transportar</w:t>
-      </w:r>
-      <w:proofErr w:type="gramEnd"/>
-      <w:r>
-        <w:rPr>
-          <w:sz w:val="24"/>
-          <w:szCs w:val="24"/>
-          <w:lang w:val="es-419"/>
-        </w:rPr>
-        <w:t xml:space="preserve">     c</w:t>
-      </w:r>
-      <w:proofErr w:type="gramStart"/>
-      <w:r>
-        <w:rPr>
-          <w:sz w:val="24"/>
-          <w:szCs w:val="24"/>
-          <w:lang w:val="es-419"/>
-        </w:rPr>
-        <w:t>)  limpiar</w:t>
-      </w:r>
-      <w:proofErr w:type="gramEnd"/>
-      <w:r>
-        <w:rPr>
-          <w:sz w:val="24"/>
-          <w:szCs w:val="24"/>
-          <w:lang w:val="es-419"/>
-        </w:rPr>
-        <w:t xml:space="preserve">   </w:t>
+        <w:t xml:space="preserve">a)  poner     b)  transportar     c)  limpiar   </w:t>
       </w:r>
     </w:p>
     <w:p>
@@ -3413,43 +2329,7 @@
           <w:szCs w:val="24"/>
           <w:lang w:val="es-419"/>
         </w:rPr>
-        <w:t xml:space="preserve">a)  corral     </w:t>
-      </w:r>
-      <w:proofErr w:type="gramStart"/>
-      <w:r>
-        <w:rPr>
-          <w:sz w:val="24"/>
-          <w:szCs w:val="24"/>
-          <w:lang w:val="es-419"/>
-        </w:rPr>
-        <w:t>b)  laguna</w:t>
-      </w:r>
-      <w:proofErr w:type="gramEnd"/>
-      <w:r>
-        <w:rPr>
-          <w:sz w:val="24"/>
-          <w:szCs w:val="24"/>
-          <w:lang w:val="es-419"/>
-        </w:rPr>
-        <w:t xml:space="preserve">     c</w:t>
-      </w:r>
-      <w:proofErr w:type="gramStart"/>
-      <w:r>
-        <w:rPr>
-          <w:sz w:val="24"/>
-          <w:szCs w:val="24"/>
-          <w:lang w:val="es-419"/>
-        </w:rPr>
-        <w:t>)  establo</w:t>
-      </w:r>
-      <w:proofErr w:type="gramEnd"/>
-      <w:r>
-        <w:rPr>
-          <w:sz w:val="24"/>
-          <w:szCs w:val="24"/>
-          <w:lang w:val="es-419"/>
-        </w:rPr>
-        <w:t xml:space="preserve">   </w:t>
+        <w:t xml:space="preserve">a)  corral     b)  laguna     c)  establo   </w:t>
       </w:r>
     </w:p>
     <w:p>
@@ -3508,43 +2388,7 @@
           <w:szCs w:val="24"/>
           <w:lang w:val="es-419"/>
         </w:rPr>
-        <w:t xml:space="preserve">a)  cargar     </w:t>
-      </w:r>
-      <w:proofErr w:type="gramStart"/>
-      <w:r>
-        <w:rPr>
-          <w:sz w:val="24"/>
-          <w:szCs w:val="24"/>
-          <w:lang w:val="es-419"/>
-        </w:rPr>
-        <w:t>b)  mover</w:t>
-      </w:r>
-      <w:proofErr w:type="gramEnd"/>
-      <w:r>
-        <w:rPr>
-          <w:sz w:val="24"/>
-          <w:szCs w:val="24"/>
-          <w:lang w:val="es-419"/>
-        </w:rPr>
-        <w:t xml:space="preserve">     c</w:t>
-      </w:r>
-      <w:proofErr w:type="gramStart"/>
-      <w:r>
-        <w:rPr>
-          <w:sz w:val="24"/>
-          <w:szCs w:val="24"/>
-          <w:lang w:val="es-419"/>
-        </w:rPr>
-        <w:t>)  sacar</w:t>
-      </w:r>
-      <w:proofErr w:type="gramEnd"/>
-      <w:r>
-        <w:rPr>
-          <w:sz w:val="24"/>
-          <w:szCs w:val="24"/>
-          <w:lang w:val="es-419"/>
-        </w:rPr>
-        <w:t xml:space="preserve">   </w:t>
+        <w:t xml:space="preserve">a)  cargar     b)  mover     c)  sacar   </w:t>
       </w:r>
     </w:p>
     <w:p>
@@ -3610,43 +2454,7 @@
           <w:szCs w:val="24"/>
           <w:lang w:val="es-419"/>
         </w:rPr>
-        <w:t xml:space="preserve">a)  heno     </w:t>
-      </w:r>
-      <w:proofErr w:type="gramStart"/>
-      <w:r>
-        <w:rPr>
-          <w:sz w:val="24"/>
-          <w:szCs w:val="24"/>
-          <w:lang w:val="es-419"/>
-        </w:rPr>
-        <w:t>b)  ensilaje</w:t>
-      </w:r>
-      <w:proofErr w:type="gramEnd"/>
-      <w:r>
-        <w:rPr>
-          <w:sz w:val="24"/>
-          <w:szCs w:val="24"/>
-          <w:lang w:val="es-419"/>
-        </w:rPr>
-        <w:t xml:space="preserve">     c</w:t>
-      </w:r>
-      <w:proofErr w:type="gramStart"/>
-      <w:r>
-        <w:rPr>
-          <w:sz w:val="24"/>
-          <w:szCs w:val="24"/>
-          <w:lang w:val="es-419"/>
-        </w:rPr>
-        <w:t>)  maíz</w:t>
-      </w:r>
-      <w:proofErr w:type="gramEnd"/>
-      <w:r>
-        <w:rPr>
-          <w:sz w:val="24"/>
-          <w:szCs w:val="24"/>
-          <w:lang w:val="es-419"/>
-        </w:rPr>
-        <w:t xml:space="preserve">   </w:t>
+        <w:t xml:space="preserve">a)  heno     b)  ensilaje     c)  maíz   </w:t>
       </w:r>
     </w:p>
     <w:p>
@@ -3712,43 +2520,7 @@
           <w:szCs w:val="24"/>
           <w:lang w:val="es-419"/>
         </w:rPr>
-        <w:t xml:space="preserve">a)  llantas     </w:t>
-      </w:r>
-      <w:proofErr w:type="gramStart"/>
-      <w:r>
-        <w:rPr>
-          <w:sz w:val="24"/>
-          <w:szCs w:val="24"/>
-          <w:lang w:val="es-419"/>
-        </w:rPr>
-        <w:t>b)  cubetas</w:t>
-      </w:r>
-      <w:proofErr w:type="gramEnd"/>
-      <w:r>
-        <w:rPr>
-          <w:sz w:val="24"/>
-          <w:szCs w:val="24"/>
-          <w:lang w:val="es-419"/>
-        </w:rPr>
-        <w:t xml:space="preserve">     c</w:t>
-      </w:r>
-      <w:proofErr w:type="gramStart"/>
-      <w:r>
-        <w:rPr>
-          <w:sz w:val="24"/>
-          <w:szCs w:val="24"/>
-          <w:lang w:val="es-419"/>
-        </w:rPr>
-        <w:t>)  pacas</w:t>
-      </w:r>
-      <w:proofErr w:type="gramEnd"/>
-      <w:r>
-        <w:rPr>
-          <w:sz w:val="24"/>
-          <w:szCs w:val="24"/>
-          <w:lang w:val="es-419"/>
-        </w:rPr>
-        <w:t xml:space="preserve">   </w:t>
+        <w:t xml:space="preserve">a)  llantas     b)  cubetas     c)  pacas   </w:t>
       </w:r>
     </w:p>
     <w:p>
@@ -3814,43 +2586,7 @@
           <w:szCs w:val="24"/>
           <w:lang w:val="es-419"/>
         </w:rPr>
-        <w:t xml:space="preserve">a)  tractor     </w:t>
-      </w:r>
-      <w:proofErr w:type="gramStart"/>
-      <w:r>
-        <w:rPr>
-          <w:sz w:val="24"/>
-          <w:szCs w:val="24"/>
-          <w:lang w:val="es-419"/>
-        </w:rPr>
-        <w:t>b)  remolque</w:t>
-      </w:r>
-      <w:proofErr w:type="gramEnd"/>
-      <w:r>
-        <w:rPr>
-          <w:sz w:val="24"/>
-          <w:szCs w:val="24"/>
-          <w:lang w:val="es-419"/>
-        </w:rPr>
-        <w:t xml:space="preserve">     c</w:t>
-      </w:r>
-      <w:proofErr w:type="gramStart"/>
-      <w:r>
-        <w:rPr>
-          <w:sz w:val="24"/>
-          <w:szCs w:val="24"/>
-          <w:lang w:val="es-419"/>
-        </w:rPr>
-        <w:t>)  cargadora</w:t>
-      </w:r>
-      <w:proofErr w:type="gramEnd"/>
-      <w:r>
-        <w:rPr>
-          <w:sz w:val="24"/>
-          <w:szCs w:val="24"/>
-          <w:lang w:val="es-419"/>
-        </w:rPr>
-        <w:t xml:space="preserve"> </w:t>
+        <w:t xml:space="preserve">a)  tractor     b)  remolque     c)  cargadora </w:t>
       </w:r>
     </w:p>
     <w:p>
@@ -4076,43 +2812,7 @@
           <w:szCs w:val="24"/>
           <w:lang w:val="es-419"/>
         </w:rPr>
-        <w:t xml:space="preserve">a)  martillo     </w:t>
-      </w:r>
-      <w:proofErr w:type="gramStart"/>
-      <w:r>
-        <w:rPr>
-          <w:sz w:val="24"/>
-          <w:szCs w:val="24"/>
-          <w:lang w:val="es-419"/>
-        </w:rPr>
-        <w:t>b)  taladro</w:t>
-      </w:r>
-      <w:proofErr w:type="gramEnd"/>
-      <w:r>
-        <w:rPr>
-          <w:sz w:val="24"/>
-          <w:szCs w:val="24"/>
-          <w:lang w:val="es-419"/>
-        </w:rPr>
-        <w:t xml:space="preserve">     c</w:t>
-      </w:r>
-      <w:proofErr w:type="gramStart"/>
-      <w:r>
-        <w:rPr>
-          <w:sz w:val="24"/>
-          <w:szCs w:val="24"/>
-          <w:lang w:val="es-419"/>
-        </w:rPr>
-        <w:t>)  desarmador</w:t>
-      </w:r>
-      <w:proofErr w:type="gramEnd"/>
-      <w:r>
-        <w:rPr>
-          <w:sz w:val="24"/>
-          <w:szCs w:val="24"/>
-          <w:lang w:val="es-419"/>
-        </w:rPr>
-        <w:t xml:space="preserve">   </w:t>
+        <w:t xml:space="preserve">a)  martillo     b)  taladro     c)  desarmador   </w:t>
       </w:r>
     </w:p>
     <w:p>
@@ -4178,43 +2878,7 @@
           <w:szCs w:val="24"/>
           <w:lang w:val="es-419"/>
         </w:rPr>
-        <w:t xml:space="preserve">a)  limpiar     </w:t>
-      </w:r>
-      <w:proofErr w:type="gramStart"/>
-      <w:r>
-        <w:rPr>
-          <w:sz w:val="24"/>
-          <w:szCs w:val="24"/>
-          <w:lang w:val="es-419"/>
-        </w:rPr>
-        <w:t>b)  arreglar</w:t>
-      </w:r>
-      <w:proofErr w:type="gramEnd"/>
-      <w:r>
-        <w:rPr>
-          <w:sz w:val="24"/>
-          <w:szCs w:val="24"/>
-          <w:lang w:val="es-419"/>
-        </w:rPr>
-        <w:t xml:space="preserve">     c</w:t>
-      </w:r>
-      <w:proofErr w:type="gramStart"/>
-      <w:r>
-        <w:rPr>
-          <w:sz w:val="24"/>
-          <w:szCs w:val="24"/>
-          <w:lang w:val="es-419"/>
-        </w:rPr>
-        <w:t>)  doblar</w:t>
-      </w:r>
-      <w:proofErr w:type="gramEnd"/>
-      <w:r>
-        <w:rPr>
-          <w:sz w:val="24"/>
-          <w:szCs w:val="24"/>
-          <w:lang w:val="es-419"/>
-        </w:rPr>
-        <w:t xml:space="preserve">   </w:t>
+        <w:t xml:space="preserve">a)  limpiar     b)  arreglar     c)  doblar   </w:t>
       </w:r>
     </w:p>
     <w:p>
@@ -4280,43 +2944,7 @@
           <w:szCs w:val="24"/>
           <w:lang w:val="es-419"/>
         </w:rPr>
-        <w:t xml:space="preserve">a)  cerca     </w:t>
-      </w:r>
-      <w:proofErr w:type="gramStart"/>
-      <w:r>
-        <w:rPr>
-          <w:sz w:val="24"/>
-          <w:szCs w:val="24"/>
-          <w:lang w:val="es-419"/>
-        </w:rPr>
-        <w:t>b)  puerta</w:t>
-      </w:r>
-      <w:proofErr w:type="gramEnd"/>
-      <w:r>
-        <w:rPr>
-          <w:sz w:val="24"/>
-          <w:szCs w:val="24"/>
-          <w:lang w:val="es-419"/>
-        </w:rPr>
-        <w:t xml:space="preserve">     c</w:t>
-      </w:r>
-      <w:proofErr w:type="gramStart"/>
-      <w:r>
-        <w:rPr>
-          <w:sz w:val="24"/>
-          <w:szCs w:val="24"/>
-          <w:lang w:val="es-419"/>
-        </w:rPr>
-        <w:t>)  establo</w:t>
-      </w:r>
-      <w:proofErr w:type="gramEnd"/>
-      <w:r>
-        <w:rPr>
-          <w:sz w:val="24"/>
-          <w:szCs w:val="24"/>
-          <w:lang w:val="es-419"/>
-        </w:rPr>
-        <w:t xml:space="preserve">   </w:t>
+        <w:t xml:space="preserve">a)  cerca     b)  puerta     c)  establo   </w:t>
       </w:r>
     </w:p>
     <w:p>
@@ -4382,43 +3010,7 @@
           <w:szCs w:val="24"/>
           <w:lang w:val="es-419"/>
         </w:rPr>
-        <w:t xml:space="preserve">a)  bisagra     </w:t>
-      </w:r>
-      <w:proofErr w:type="gramStart"/>
-      <w:r>
-        <w:rPr>
-          <w:sz w:val="24"/>
-          <w:szCs w:val="24"/>
-          <w:lang w:val="es-419"/>
-        </w:rPr>
-        <w:t>b)  poste</w:t>
-      </w:r>
-      <w:proofErr w:type="gramEnd"/>
-      <w:r>
-        <w:rPr>
-          <w:sz w:val="24"/>
-          <w:szCs w:val="24"/>
-          <w:lang w:val="es-419"/>
-        </w:rPr>
-        <w:t xml:space="preserve">     c</w:t>
-      </w:r>
-      <w:proofErr w:type="gramStart"/>
-      <w:r>
-        <w:rPr>
-          <w:sz w:val="24"/>
-          <w:szCs w:val="24"/>
-          <w:lang w:val="es-419"/>
-        </w:rPr>
-        <w:t>)  pestillo</w:t>
-      </w:r>
-      <w:proofErr w:type="gramEnd"/>
-      <w:r>
-        <w:rPr>
-          <w:sz w:val="24"/>
-          <w:szCs w:val="24"/>
-          <w:lang w:val="es-419"/>
-        </w:rPr>
-        <w:t xml:space="preserve">   </w:t>
+        <w:t xml:space="preserve">a)  bisagra     b)  poste     c)  pestillo   </w:t>
       </w:r>
     </w:p>
     <w:p>
@@ -4484,43 +3076,7 @@
           <w:szCs w:val="24"/>
           <w:lang w:val="es-419"/>
         </w:rPr>
-        <w:t xml:space="preserve">a)  llave     </w:t>
-      </w:r>
-      <w:proofErr w:type="gramStart"/>
-      <w:r>
-        <w:rPr>
-          <w:sz w:val="24"/>
-          <w:szCs w:val="24"/>
-          <w:lang w:val="es-419"/>
-        </w:rPr>
-        <w:t>b)  martillo</w:t>
-      </w:r>
-      <w:proofErr w:type="gramEnd"/>
-      <w:r>
-        <w:rPr>
-          <w:sz w:val="24"/>
-          <w:szCs w:val="24"/>
-          <w:lang w:val="es-419"/>
-        </w:rPr>
-        <w:t xml:space="preserve">     c</w:t>
-      </w:r>
-      <w:proofErr w:type="gramStart"/>
-      <w:r>
-        <w:rPr>
-          <w:sz w:val="24"/>
-          <w:szCs w:val="24"/>
-          <w:lang w:val="es-419"/>
-        </w:rPr>
-        <w:t>)  desarmador</w:t>
-      </w:r>
-      <w:proofErr w:type="gramEnd"/>
-      <w:r>
-        <w:rPr>
-          <w:sz w:val="24"/>
-          <w:szCs w:val="24"/>
-          <w:lang w:val="es-419"/>
-        </w:rPr>
-        <w:t xml:space="preserve">   </w:t>
+        <w:t xml:space="preserve">a)  llave     b)  martillo     c)  desarmador   </w:t>
       </w:r>
     </w:p>
     <w:p>
@@ -4586,43 +3142,7 @@
           <w:szCs w:val="24"/>
           <w:lang w:val="es-419"/>
         </w:rPr>
-        <w:t xml:space="preserve">a)  apretar     </w:t>
-      </w:r>
-      <w:proofErr w:type="gramStart"/>
-      <w:r>
-        <w:rPr>
-          <w:sz w:val="24"/>
-          <w:szCs w:val="24"/>
-          <w:lang w:val="es-419"/>
-        </w:rPr>
-        <w:t>b)  fijar</w:t>
-      </w:r>
-      <w:proofErr w:type="gramEnd"/>
-      <w:r>
-        <w:rPr>
-          <w:sz w:val="24"/>
-          <w:szCs w:val="24"/>
-          <w:lang w:val="es-419"/>
-        </w:rPr>
-        <w:t xml:space="preserve">     c</w:t>
-      </w:r>
-      <w:proofErr w:type="gramStart"/>
-      <w:r>
-        <w:rPr>
-          <w:sz w:val="24"/>
-          <w:szCs w:val="24"/>
-          <w:lang w:val="es-419"/>
-        </w:rPr>
-        <w:t>)  doblar</w:t>
-      </w:r>
-      <w:proofErr w:type="gramEnd"/>
-      <w:r>
-        <w:rPr>
-          <w:sz w:val="24"/>
-          <w:szCs w:val="24"/>
-          <w:lang w:val="es-419"/>
-        </w:rPr>
-        <w:t xml:space="preserve">   </w:t>
+        <w:t xml:space="preserve">a)  apretar     b)  fijar     c)  doblar   </w:t>
       </w:r>
     </w:p>
     <w:p>
@@ -4688,43 +3208,7 @@
           <w:szCs w:val="24"/>
           <w:lang w:val="es-419"/>
         </w:rPr>
-        <w:t xml:space="preserve">a)  clavo     </w:t>
-      </w:r>
-      <w:proofErr w:type="gramStart"/>
-      <w:r>
-        <w:rPr>
-          <w:sz w:val="24"/>
-          <w:szCs w:val="24"/>
-          <w:lang w:val="es-419"/>
-        </w:rPr>
-        <w:t>b)  tornillo</w:t>
-      </w:r>
-      <w:proofErr w:type="gramEnd"/>
-      <w:r>
-        <w:rPr>
-          <w:sz w:val="24"/>
-          <w:szCs w:val="24"/>
-          <w:lang w:val="es-419"/>
-        </w:rPr>
-        <w:t xml:space="preserve">     c</w:t>
-      </w:r>
-      <w:proofErr w:type="gramStart"/>
-      <w:r>
-        <w:rPr>
-          <w:sz w:val="24"/>
-          <w:szCs w:val="24"/>
-          <w:lang w:val="es-419"/>
-        </w:rPr>
-        <w:t>)  tuerca</w:t>
-      </w:r>
-      <w:proofErr w:type="gramEnd"/>
-      <w:r>
-        <w:rPr>
-          <w:sz w:val="24"/>
-          <w:szCs w:val="24"/>
-          <w:lang w:val="es-419"/>
-        </w:rPr>
-        <w:t xml:space="preserve">   </w:t>
+        <w:t xml:space="preserve">a)  clavo     b)  tornillo     c)  tuerca   </w:t>
       </w:r>
     </w:p>
     <w:p>
@@ -4790,43 +3274,7 @@
           <w:szCs w:val="24"/>
           <w:lang w:val="es-419"/>
         </w:rPr>
-        <w:t xml:space="preserve">a)  bisagra     </w:t>
-      </w:r>
-      <w:proofErr w:type="gramStart"/>
-      <w:r>
-        <w:rPr>
-          <w:sz w:val="24"/>
-          <w:szCs w:val="24"/>
-          <w:lang w:val="es-419"/>
-        </w:rPr>
-        <w:t>b)  pestillo</w:t>
-      </w:r>
-      <w:proofErr w:type="gramEnd"/>
-      <w:r>
-        <w:rPr>
-          <w:sz w:val="24"/>
-          <w:szCs w:val="24"/>
-          <w:lang w:val="es-419"/>
-        </w:rPr>
-        <w:t xml:space="preserve">     c</w:t>
-      </w:r>
-      <w:proofErr w:type="gramStart"/>
-      <w:r>
-        <w:rPr>
-          <w:sz w:val="24"/>
-          <w:szCs w:val="24"/>
-          <w:lang w:val="es-419"/>
-        </w:rPr>
-        <w:t>)  poste</w:t>
-      </w:r>
-      <w:proofErr w:type="gramEnd"/>
-      <w:r>
-        <w:rPr>
-          <w:sz w:val="24"/>
-          <w:szCs w:val="24"/>
-          <w:lang w:val="es-419"/>
-        </w:rPr>
-        <w:t xml:space="preserve">   </w:t>
+        <w:t xml:space="preserve">a)  bisagra     b)  pestillo     c)  poste   </w:t>
       </w:r>
     </w:p>
     <w:p>
@@ -4892,43 +3340,7 @@
           <w:szCs w:val="24"/>
           <w:lang w:val="es-419"/>
         </w:rPr>
-        <w:t xml:space="preserve">a)  taladro     </w:t>
-      </w:r>
-      <w:proofErr w:type="gramStart"/>
-      <w:r>
-        <w:rPr>
-          <w:sz w:val="24"/>
-          <w:szCs w:val="24"/>
-          <w:lang w:val="es-419"/>
-        </w:rPr>
-        <w:t>b)  martillo</w:t>
-      </w:r>
-      <w:proofErr w:type="gramEnd"/>
-      <w:r>
-        <w:rPr>
-          <w:sz w:val="24"/>
-          <w:szCs w:val="24"/>
-          <w:lang w:val="es-419"/>
-        </w:rPr>
-        <w:t xml:space="preserve">     c</w:t>
-      </w:r>
-      <w:proofErr w:type="gramStart"/>
-      <w:r>
-        <w:rPr>
-          <w:sz w:val="24"/>
-          <w:szCs w:val="24"/>
-          <w:lang w:val="es-419"/>
-        </w:rPr>
-        <w:t>)  clavadora</w:t>
-      </w:r>
-      <w:proofErr w:type="gramEnd"/>
-      <w:r>
-        <w:rPr>
-          <w:sz w:val="24"/>
-          <w:szCs w:val="24"/>
-          <w:lang w:val="es-419"/>
-        </w:rPr>
-        <w:t xml:space="preserve">   </w:t>
+        <w:t xml:space="preserve">a)  taladro     b)  martillo     c)  clavadora   </w:t>
       </w:r>
     </w:p>
     <w:p>
@@ -4994,43 +3406,7 @@
           <w:szCs w:val="24"/>
           <w:lang w:val="es-419"/>
         </w:rPr>
-        <w:t xml:space="preserve">a)  apretar     </w:t>
-      </w:r>
-      <w:proofErr w:type="gramStart"/>
-      <w:r>
-        <w:rPr>
-          <w:sz w:val="24"/>
-          <w:szCs w:val="24"/>
-          <w:lang w:val="es-419"/>
-        </w:rPr>
-        <w:t>b)  limpiar</w:t>
-      </w:r>
-      <w:proofErr w:type="gramEnd"/>
-      <w:r>
-        <w:rPr>
-          <w:sz w:val="24"/>
-          <w:szCs w:val="24"/>
-          <w:lang w:val="es-419"/>
-        </w:rPr>
-        <w:t xml:space="preserve">     c</w:t>
-      </w:r>
-      <w:proofErr w:type="gramStart"/>
-      <w:r>
-        <w:rPr>
-          <w:sz w:val="24"/>
-          <w:szCs w:val="24"/>
-          <w:lang w:val="es-419"/>
-        </w:rPr>
-        <w:t>)  fijar</w:t>
-      </w:r>
-      <w:proofErr w:type="gramEnd"/>
-      <w:r>
-        <w:rPr>
-          <w:sz w:val="24"/>
-          <w:szCs w:val="24"/>
-          <w:lang w:val="es-419"/>
-        </w:rPr>
-        <w:t xml:space="preserve">   </w:t>
+        <w:t xml:space="preserve">a)  apretar     b)  limpiar     c)  fijar   </w:t>
       </w:r>
     </w:p>
     <w:p>
@@ -5096,43 +3472,7 @@
           <w:szCs w:val="24"/>
           <w:lang w:val="es-419"/>
         </w:rPr>
-        <w:t xml:space="preserve">a)  tablas     </w:t>
-      </w:r>
-      <w:proofErr w:type="gramStart"/>
-      <w:r>
-        <w:rPr>
-          <w:sz w:val="24"/>
-          <w:szCs w:val="24"/>
-          <w:lang w:val="es-419"/>
-        </w:rPr>
-        <w:t>b)  grapas</w:t>
-      </w:r>
-      <w:proofErr w:type="gramEnd"/>
-      <w:r>
-        <w:rPr>
-          <w:sz w:val="24"/>
-          <w:szCs w:val="24"/>
-          <w:lang w:val="es-419"/>
-        </w:rPr>
-        <w:t xml:space="preserve">     c</w:t>
-      </w:r>
-      <w:proofErr w:type="gramStart"/>
-      <w:r>
-        <w:rPr>
-          <w:sz w:val="24"/>
-          <w:szCs w:val="24"/>
-          <w:lang w:val="es-419"/>
-        </w:rPr>
-        <w:t>)  postes</w:t>
-      </w:r>
-      <w:proofErr w:type="gramEnd"/>
-      <w:r>
-        <w:rPr>
-          <w:sz w:val="24"/>
-          <w:szCs w:val="24"/>
-          <w:lang w:val="es-419"/>
-        </w:rPr>
-        <w:t xml:space="preserve">   </w:t>
+        <w:t xml:space="preserve">a)  tablas     b)  grapas     c)  postes   </w:t>
       </w:r>
     </w:p>
     <w:p>
@@ -5198,43 +3538,7 @@
           <w:szCs w:val="24"/>
           <w:lang w:val="es-419"/>
         </w:rPr>
-        <w:t xml:space="preserve">a)  pasillo     </w:t>
-      </w:r>
-      <w:proofErr w:type="gramStart"/>
-      <w:r>
-        <w:rPr>
-          <w:sz w:val="24"/>
-          <w:szCs w:val="24"/>
-          <w:lang w:val="es-419"/>
-        </w:rPr>
-        <w:t>b)  poste</w:t>
-      </w:r>
-      <w:proofErr w:type="gramEnd"/>
-      <w:r>
-        <w:rPr>
-          <w:sz w:val="24"/>
-          <w:szCs w:val="24"/>
-          <w:lang w:val="es-419"/>
-        </w:rPr>
-        <w:t xml:space="preserve">     c</w:t>
-      </w:r>
-      <w:proofErr w:type="gramStart"/>
-      <w:r>
-        <w:rPr>
-          <w:sz w:val="24"/>
-          <w:szCs w:val="24"/>
-          <w:lang w:val="es-419"/>
-        </w:rPr>
-        <w:t>)  marco</w:t>
-      </w:r>
-      <w:proofErr w:type="gramEnd"/>
-      <w:r>
-        <w:rPr>
-          <w:sz w:val="24"/>
-          <w:szCs w:val="24"/>
-          <w:lang w:val="es-419"/>
-        </w:rPr>
-        <w:t xml:space="preserve"> de la cerca   </w:t>
+        <w:t xml:space="preserve">a)  pasillo     b)  poste     c)  marco de la cerca   </w:t>
       </w:r>
     </w:p>
     <w:p>
@@ -5300,43 +3604,7 @@
           <w:szCs w:val="24"/>
           <w:lang w:val="es-419"/>
         </w:rPr>
-        <w:t xml:space="preserve">a)  grapas     </w:t>
-      </w:r>
-      <w:proofErr w:type="gramStart"/>
-      <w:r>
-        <w:rPr>
-          <w:sz w:val="24"/>
-          <w:szCs w:val="24"/>
-          <w:lang w:val="es-419"/>
-        </w:rPr>
-        <w:t>b)  tornillos</w:t>
-      </w:r>
-      <w:proofErr w:type="gramEnd"/>
-      <w:r>
-        <w:rPr>
-          <w:sz w:val="24"/>
-          <w:szCs w:val="24"/>
-          <w:lang w:val="es-419"/>
-        </w:rPr>
-        <w:t xml:space="preserve">     c</w:t>
-      </w:r>
-      <w:proofErr w:type="gramStart"/>
-      <w:r>
-        <w:rPr>
-          <w:sz w:val="24"/>
-          <w:szCs w:val="24"/>
-          <w:lang w:val="es-419"/>
-        </w:rPr>
-        <w:t>)  cadena</w:t>
-      </w:r>
-      <w:proofErr w:type="gramEnd"/>
-      <w:r>
-        <w:rPr>
-          <w:sz w:val="24"/>
-          <w:szCs w:val="24"/>
-          <w:lang w:val="es-419"/>
-        </w:rPr>
-        <w:t xml:space="preserve">   </w:t>
+        <w:t xml:space="preserve">a)  grapas     b)  tornillos     c)  cadena   </w:t>
       </w:r>
     </w:p>
     <w:p>
@@ -5402,43 +3670,7 @@
           <w:szCs w:val="24"/>
           <w:lang w:val="es-419"/>
         </w:rPr>
-        <w:t xml:space="preserve">a)  cuerda     </w:t>
-      </w:r>
-      <w:proofErr w:type="gramStart"/>
-      <w:r>
-        <w:rPr>
-          <w:sz w:val="24"/>
-          <w:szCs w:val="24"/>
-          <w:lang w:val="es-419"/>
-        </w:rPr>
-        <w:t>b)  cadena</w:t>
-      </w:r>
-      <w:proofErr w:type="gramEnd"/>
-      <w:r>
-        <w:rPr>
-          <w:sz w:val="24"/>
-          <w:szCs w:val="24"/>
-          <w:lang w:val="es-419"/>
-        </w:rPr>
-        <w:t xml:space="preserve">     c</w:t>
-      </w:r>
-      <w:proofErr w:type="gramStart"/>
-      <w:r>
-        <w:rPr>
-          <w:sz w:val="24"/>
-          <w:szCs w:val="24"/>
-          <w:lang w:val="es-419"/>
-        </w:rPr>
-        <w:t>)  alambre</w:t>
-      </w:r>
-      <w:proofErr w:type="gramEnd"/>
-      <w:r>
-        <w:rPr>
-          <w:sz w:val="24"/>
-          <w:szCs w:val="24"/>
-          <w:lang w:val="es-419"/>
-        </w:rPr>
-        <w:t xml:space="preserve">   </w:t>
+        <w:t xml:space="preserve">a)  cuerda     b)  cadena     c)  alambre   </w:t>
       </w:r>
     </w:p>
     <w:p>
@@ -5497,43 +3729,7 @@
           <w:szCs w:val="24"/>
           <w:lang w:val="es-419"/>
         </w:rPr>
-        <w:t xml:space="preserve">a)  amarrar     </w:t>
-      </w:r>
-      <w:proofErr w:type="gramStart"/>
-      <w:r>
-        <w:rPr>
-          <w:sz w:val="24"/>
-          <w:szCs w:val="24"/>
-          <w:lang w:val="es-419"/>
-        </w:rPr>
-        <w:t>b)  conectar</w:t>
-      </w:r>
-      <w:proofErr w:type="gramEnd"/>
-      <w:r>
-        <w:rPr>
-          <w:sz w:val="24"/>
-          <w:szCs w:val="24"/>
-          <w:lang w:val="es-419"/>
-        </w:rPr>
-        <w:t xml:space="preserve">     c</w:t>
-      </w:r>
-      <w:proofErr w:type="gramStart"/>
-      <w:r>
-        <w:rPr>
-          <w:sz w:val="24"/>
-          <w:szCs w:val="24"/>
-          <w:lang w:val="es-419"/>
-        </w:rPr>
-        <w:t>)  fijar</w:t>
-      </w:r>
-      <w:proofErr w:type="gramEnd"/>
-      <w:r>
-        <w:rPr>
-          <w:sz w:val="24"/>
-          <w:szCs w:val="24"/>
-          <w:lang w:val="es-419"/>
-        </w:rPr>
-        <w:t xml:space="preserve">   </w:t>
+        <w:t xml:space="preserve">a)  amarrar     b)  conectar     c)  fijar   </w:t>
       </w:r>
     </w:p>
     <w:p>
@@ -5599,43 +3795,7 @@
           <w:szCs w:val="24"/>
           <w:lang w:val="es-419"/>
         </w:rPr>
-        <w:t xml:space="preserve">a)  cuerda     </w:t>
-      </w:r>
-      <w:proofErr w:type="gramStart"/>
-      <w:r>
-        <w:rPr>
-          <w:sz w:val="24"/>
-          <w:szCs w:val="24"/>
-          <w:lang w:val="es-419"/>
-        </w:rPr>
-        <w:t>b)  alambre</w:t>
-      </w:r>
-      <w:proofErr w:type="gramEnd"/>
-      <w:r>
-        <w:rPr>
-          <w:sz w:val="24"/>
-          <w:szCs w:val="24"/>
-          <w:lang w:val="es-419"/>
-        </w:rPr>
-        <w:t xml:space="preserve">     c</w:t>
-      </w:r>
-      <w:proofErr w:type="gramStart"/>
-      <w:r>
-        <w:rPr>
-          <w:sz w:val="24"/>
-          <w:szCs w:val="24"/>
-          <w:lang w:val="es-419"/>
-        </w:rPr>
-        <w:t>)  cadena</w:t>
-      </w:r>
-      <w:proofErr w:type="gramEnd"/>
-      <w:r>
-        <w:rPr>
-          <w:sz w:val="24"/>
-          <w:szCs w:val="24"/>
-          <w:lang w:val="es-419"/>
-        </w:rPr>
-        <w:t xml:space="preserve">   </w:t>
+        <w:t xml:space="preserve">a)  cuerda     b)  alambre     c)  cadena   </w:t>
       </w:r>
     </w:p>
     <w:p>
@@ -5701,43 +3861,7 @@
           <w:szCs w:val="24"/>
           <w:lang w:val="es-419"/>
         </w:rPr>
-        <w:t xml:space="preserve">a)  poste     </w:t>
-      </w:r>
-      <w:proofErr w:type="gramStart"/>
-      <w:r>
-        <w:rPr>
-          <w:sz w:val="24"/>
-          <w:szCs w:val="24"/>
-          <w:lang w:val="es-419"/>
-        </w:rPr>
-        <w:t>b)  bisagra</w:t>
-      </w:r>
-      <w:proofErr w:type="gramEnd"/>
-      <w:r>
-        <w:rPr>
-          <w:sz w:val="24"/>
-          <w:szCs w:val="24"/>
-          <w:lang w:val="es-419"/>
-        </w:rPr>
-        <w:t xml:space="preserve">     c</w:t>
-      </w:r>
-      <w:proofErr w:type="gramStart"/>
-      <w:r>
-        <w:rPr>
-          <w:sz w:val="24"/>
-          <w:szCs w:val="24"/>
-          <w:lang w:val="es-419"/>
-        </w:rPr>
-        <w:t>)  pestillo</w:t>
-      </w:r>
-      <w:proofErr w:type="gramEnd"/>
-      <w:r>
-        <w:rPr>
-          <w:sz w:val="24"/>
-          <w:szCs w:val="24"/>
-          <w:lang w:val="es-419"/>
-        </w:rPr>
-        <w:t xml:space="preserve">   </w:t>
+        <w:t xml:space="preserve">a)  poste     b)  bisagra     c)  pestillo   </w:t>
       </w:r>
     </w:p>
     <w:p>
@@ -5803,43 +3927,7 @@
           <w:szCs w:val="24"/>
           <w:lang w:val="es-419"/>
         </w:rPr>
-        <w:t xml:space="preserve">a)  cerrar     </w:t>
-      </w:r>
-      <w:proofErr w:type="gramStart"/>
-      <w:r>
-        <w:rPr>
-          <w:sz w:val="24"/>
-          <w:szCs w:val="24"/>
-          <w:lang w:val="es-419"/>
-        </w:rPr>
-        <w:t>b)  fijar</w:t>
-      </w:r>
-      <w:proofErr w:type="gramEnd"/>
-      <w:r>
-        <w:rPr>
-          <w:sz w:val="24"/>
-          <w:szCs w:val="24"/>
-          <w:lang w:val="es-419"/>
-        </w:rPr>
-        <w:t xml:space="preserve">     c</w:t>
-      </w:r>
-      <w:proofErr w:type="gramStart"/>
-      <w:r>
-        <w:rPr>
-          <w:sz w:val="24"/>
-          <w:szCs w:val="24"/>
-          <w:lang w:val="es-419"/>
-        </w:rPr>
-        <w:t>)  amarrar</w:t>
-      </w:r>
-      <w:proofErr w:type="gramEnd"/>
-      <w:r>
-        <w:rPr>
-          <w:sz w:val="24"/>
-          <w:szCs w:val="24"/>
-          <w:lang w:val="es-419"/>
-        </w:rPr>
-        <w:t xml:space="preserve">   </w:t>
+        <w:t xml:space="preserve">a)  cerrar     b)  fijar     c)  amarrar   </w:t>
       </w:r>
     </w:p>
     <w:p>
@@ -5949,6 +4037,7 @@
         <w:spacing w:before="80" w:after="20"/>
         <w:rPr>
           <w:b/>
+          <w:lang w:val="es-419"/>
         </w:rPr>
         <w:sectPr>
           <w:type w:val="continuous"/>
@@ -5995,35 +4084,7 @@
         <w:rPr>
           <w:lang w:val="es-419"/>
         </w:rPr>
-        <w:t xml:space="preserve">a)  poner en marcha     </w:t>
-      </w:r>
-      <w:proofErr w:type="gramStart"/>
-      <w:r>
-        <w:rPr>
-          <w:lang w:val="es-419"/>
-        </w:rPr>
-        <w:t>b)  encender</w:t>
-      </w:r>
-      <w:proofErr w:type="gramEnd"/>
-      <w:r>
-        <w:rPr>
-          <w:lang w:val="es-419"/>
-        </w:rPr>
-        <w:t xml:space="preserve">     c</w:t>
-      </w:r>
-      <w:proofErr w:type="gramStart"/>
-      <w:r>
-        <w:rPr>
-          <w:lang w:val="es-419"/>
-        </w:rPr>
-        <w:t>)  conectar</w:t>
-      </w:r>
-      <w:proofErr w:type="gramEnd"/>
-      <w:r>
-        <w:rPr>
-          <w:lang w:val="es-419"/>
-        </w:rPr>
-        <w:t xml:space="preserve">   </w:t>
+        <w:t xml:space="preserve">a)  poner en marcha     b)  encender     c)  conectar   </w:t>
       </w:r>
     </w:p>
     <w:p>
@@ -6065,35 +4126,7 @@
         <w:rPr>
           <w:lang w:val="es-419"/>
         </w:rPr>
-        <w:t xml:space="preserve">a)  picadora     </w:t>
-      </w:r>
-      <w:proofErr w:type="gramStart"/>
-      <w:r>
-        <w:rPr>
-          <w:lang w:val="es-419"/>
-        </w:rPr>
-        <w:t>b)  cosechadora</w:t>
-      </w:r>
-      <w:proofErr w:type="gramEnd"/>
-      <w:r>
-        <w:rPr>
-          <w:lang w:val="es-419"/>
-        </w:rPr>
-        <w:t xml:space="preserve">     c</w:t>
-      </w:r>
-      <w:proofErr w:type="gramStart"/>
-      <w:r>
-        <w:rPr>
-          <w:lang w:val="es-419"/>
-        </w:rPr>
-        <w:t>)  mezcladora</w:t>
-      </w:r>
-      <w:proofErr w:type="gramEnd"/>
-      <w:r>
-        <w:rPr>
-          <w:lang w:val="es-419"/>
-        </w:rPr>
-        <w:t xml:space="preserve">   </w:t>
+        <w:t xml:space="preserve">a)  picadora     b)  cosechadora     c)  mezcladora   </w:t>
       </w:r>
     </w:p>
     <w:p>
@@ -6135,35 +4168,7 @@
         <w:rPr>
           <w:lang w:val="es-419"/>
         </w:rPr>
-        <w:t xml:space="preserve">a)  limpiar     </w:t>
-      </w:r>
-      <w:proofErr w:type="gramStart"/>
-      <w:r>
-        <w:rPr>
-          <w:lang w:val="es-419"/>
-        </w:rPr>
-        <w:t>b)  cortar</w:t>
-      </w:r>
-      <w:proofErr w:type="gramEnd"/>
-      <w:r>
-        <w:rPr>
-          <w:lang w:val="es-419"/>
-        </w:rPr>
-        <w:t xml:space="preserve">     c</w:t>
-      </w:r>
-      <w:proofErr w:type="gramStart"/>
-      <w:r>
-        <w:rPr>
-          <w:lang w:val="es-419"/>
-        </w:rPr>
-        <w:t>)  compactar</w:t>
-      </w:r>
-      <w:proofErr w:type="gramEnd"/>
-      <w:r>
-        <w:rPr>
-          <w:lang w:val="es-419"/>
-        </w:rPr>
-        <w:t xml:space="preserve">   </w:t>
+        <w:t xml:space="preserve">a)  limpiar     b)  cortar     c)  compactar   </w:t>
       </w:r>
     </w:p>
     <w:p>
@@ -6205,35 +4210,7 @@
         <w:rPr>
           <w:lang w:val="es-419"/>
         </w:rPr>
-        <w:t xml:space="preserve">a)  ensilaje     </w:t>
-      </w:r>
-      <w:proofErr w:type="gramStart"/>
-      <w:r>
-        <w:rPr>
-          <w:lang w:val="es-419"/>
-        </w:rPr>
-        <w:t>b)  heno</w:t>
-      </w:r>
-      <w:proofErr w:type="gramEnd"/>
-      <w:r>
-        <w:rPr>
-          <w:lang w:val="es-419"/>
-        </w:rPr>
-        <w:t xml:space="preserve">     c</w:t>
-      </w:r>
-      <w:proofErr w:type="gramStart"/>
-      <w:r>
-        <w:rPr>
-          <w:lang w:val="es-419"/>
-        </w:rPr>
-        <w:t>)  maíz</w:t>
-      </w:r>
-      <w:proofErr w:type="gramEnd"/>
-      <w:r>
-        <w:rPr>
-          <w:lang w:val="es-419"/>
-        </w:rPr>
-        <w:t xml:space="preserve">   </w:t>
+        <w:t xml:space="preserve">a)  ensilaje     b)  heno     c)  maíz   </w:t>
       </w:r>
     </w:p>
     <w:p>
@@ -6275,35 +4252,7 @@
         <w:rPr>
           <w:lang w:val="es-419"/>
         </w:rPr>
-        <w:t xml:space="preserve">a)  alimento     </w:t>
-      </w:r>
-      <w:proofErr w:type="gramStart"/>
-      <w:r>
-        <w:rPr>
-          <w:lang w:val="es-419"/>
-        </w:rPr>
-        <w:t>b)  heno</w:t>
-      </w:r>
-      <w:proofErr w:type="gramEnd"/>
-      <w:r>
-        <w:rPr>
-          <w:lang w:val="es-419"/>
-        </w:rPr>
-        <w:t xml:space="preserve">     c</w:t>
-      </w:r>
-      <w:proofErr w:type="gramStart"/>
-      <w:r>
-        <w:rPr>
-          <w:lang w:val="es-419"/>
-        </w:rPr>
-        <w:t>)  ensilaje</w:t>
-      </w:r>
-      <w:proofErr w:type="gramEnd"/>
-      <w:r>
-        <w:rPr>
-          <w:lang w:val="es-419"/>
-        </w:rPr>
-        <w:t xml:space="preserve">   </w:t>
+        <w:t xml:space="preserve">a)  alimento     b)  heno     c)  ensilaje   </w:t>
       </w:r>
     </w:p>
     <w:p>
@@ -6342,35 +4291,7 @@
         <w:rPr>
           <w:lang w:val="es-419"/>
         </w:rPr>
-        <w:t xml:space="preserve">a)  encender     </w:t>
-      </w:r>
-      <w:proofErr w:type="gramStart"/>
-      <w:r>
-        <w:rPr>
-          <w:lang w:val="es-419"/>
-        </w:rPr>
-        <w:t>b)  cargar</w:t>
-      </w:r>
-      <w:proofErr w:type="gramEnd"/>
-      <w:r>
-        <w:rPr>
-          <w:lang w:val="es-419"/>
-        </w:rPr>
-        <w:t xml:space="preserve">     c</w:t>
-      </w:r>
-      <w:proofErr w:type="gramStart"/>
-      <w:r>
-        <w:rPr>
-          <w:lang w:val="es-419"/>
-        </w:rPr>
-        <w:t>)  manejar</w:t>
-      </w:r>
-      <w:proofErr w:type="gramEnd"/>
-      <w:r>
-        <w:rPr>
-          <w:lang w:val="es-419"/>
-        </w:rPr>
-        <w:t xml:space="preserve">   </w:t>
+        <w:t xml:space="preserve">a)  encender     b)  cargar     c)  manejar   </w:t>
       </w:r>
     </w:p>
     <w:p>
@@ -6412,35 +4333,7 @@
         <w:rPr>
           <w:lang w:val="es-419"/>
         </w:rPr>
-        <w:t xml:space="preserve">a)  cargadora     </w:t>
-      </w:r>
-      <w:proofErr w:type="gramStart"/>
-      <w:r>
-        <w:rPr>
-          <w:lang w:val="es-419"/>
-        </w:rPr>
-        <w:t>b)  tractor</w:t>
-      </w:r>
-      <w:proofErr w:type="gramEnd"/>
-      <w:r>
-        <w:rPr>
-          <w:lang w:val="es-419"/>
-        </w:rPr>
-        <w:t xml:space="preserve">     c</w:t>
-      </w:r>
-      <w:proofErr w:type="gramStart"/>
-      <w:r>
-        <w:rPr>
-          <w:lang w:val="es-419"/>
-        </w:rPr>
-        <w:t>)  remolque</w:t>
-      </w:r>
-      <w:proofErr w:type="gramEnd"/>
-      <w:r>
-        <w:rPr>
-          <w:lang w:val="es-419"/>
-        </w:rPr>
-        <w:t xml:space="preserve">   </w:t>
+        <w:t xml:space="preserve">a)  cargadora     b)  tractor     c)  remolque   </w:t>
       </w:r>
     </w:p>
     <w:p>
@@ -6482,35 +4375,7 @@
         <w:rPr>
           <w:lang w:val="es-419"/>
         </w:rPr>
-        <w:t xml:space="preserve">a)  compactar     </w:t>
-      </w:r>
-      <w:proofErr w:type="gramStart"/>
-      <w:r>
-        <w:rPr>
-          <w:lang w:val="es-419"/>
-        </w:rPr>
-        <w:t>b)  limpiar</w:t>
-      </w:r>
-      <w:proofErr w:type="gramEnd"/>
-      <w:r>
-        <w:rPr>
-          <w:lang w:val="es-419"/>
-        </w:rPr>
-        <w:t xml:space="preserve">     c</w:t>
-      </w:r>
-      <w:proofErr w:type="gramStart"/>
-      <w:r>
-        <w:rPr>
-          <w:lang w:val="es-419"/>
-        </w:rPr>
-        <w:t>)  cortar</w:t>
-      </w:r>
-      <w:proofErr w:type="gramEnd"/>
-      <w:r>
-        <w:rPr>
-          <w:lang w:val="es-419"/>
-        </w:rPr>
-        <w:t xml:space="preserve">   </w:t>
+        <w:t xml:space="preserve">a)  compactar     b)  limpiar     c)  cortar   </w:t>
       </w:r>
     </w:p>
     <w:p>
@@ -6552,35 +4417,7 @@
         <w:rPr>
           <w:lang w:val="es-419"/>
         </w:rPr>
-        <w:t xml:space="preserve">a)  establo     </w:t>
-      </w:r>
-      <w:proofErr w:type="gramStart"/>
-      <w:r>
-        <w:rPr>
-          <w:lang w:val="es-419"/>
-        </w:rPr>
-        <w:t>b)  la</w:t>
-      </w:r>
-      <w:proofErr w:type="gramEnd"/>
-      <w:r>
-        <w:rPr>
-          <w:lang w:val="es-419"/>
-        </w:rPr>
-        <w:t xml:space="preserve"> pila     c</w:t>
-      </w:r>
-      <w:proofErr w:type="gramStart"/>
-      <w:r>
-        <w:rPr>
-          <w:lang w:val="es-419"/>
-        </w:rPr>
-        <w:t>)  laguna</w:t>
-      </w:r>
-      <w:proofErr w:type="gramEnd"/>
-      <w:r>
-        <w:rPr>
-          <w:lang w:val="es-419"/>
-        </w:rPr>
-        <w:t xml:space="preserve">   </w:t>
+        <w:t xml:space="preserve">a)  establo     b)  la pila     c)  laguna   </w:t>
       </w:r>
     </w:p>
     <w:p>
@@ -6622,35 +4459,7 @@
         <w:rPr>
           <w:lang w:val="es-419"/>
         </w:rPr>
-        <w:t xml:space="preserve">a)  llantas     </w:t>
-      </w:r>
-      <w:proofErr w:type="gramStart"/>
-      <w:r>
-        <w:rPr>
-          <w:lang w:val="es-419"/>
-        </w:rPr>
-        <w:t>b)  tablas</w:t>
-      </w:r>
-      <w:proofErr w:type="gramEnd"/>
-      <w:r>
-        <w:rPr>
-          <w:lang w:val="es-419"/>
-        </w:rPr>
-        <w:t xml:space="preserve">     c</w:t>
-      </w:r>
-      <w:proofErr w:type="gramStart"/>
-      <w:r>
-        <w:rPr>
-          <w:lang w:val="es-419"/>
-        </w:rPr>
-        <w:t>)  pacas</w:t>
-      </w:r>
-      <w:proofErr w:type="gramEnd"/>
-      <w:r>
-        <w:rPr>
-          <w:lang w:val="es-419"/>
-        </w:rPr>
-        <w:t xml:space="preserve">   </w:t>
+        <w:t xml:space="preserve">a)  llantas     b)  tablas     c)  pacas   </w:t>
       </w:r>
     </w:p>
     <w:p>
@@ -6692,60 +4501,59 @@
         <w:rPr>
           <w:lang w:val="es-419"/>
         </w:rPr>
-        <w:t xml:space="preserve">a)  la loma     </w:t>
-      </w:r>
-      <w:proofErr w:type="gramStart"/>
-      <w:r>
-        <w:rPr>
-          <w:lang w:val="es-419"/>
-        </w:rPr>
-        <w:t>b)  la</w:t>
-      </w:r>
-      <w:proofErr w:type="gramEnd"/>
-      <w:r>
-        <w:rPr>
-          <w:lang w:val="es-419"/>
-        </w:rPr>
-        <w:t xml:space="preserve"> laguna     c</w:t>
-      </w:r>
-      <w:proofErr w:type="gramStart"/>
-      <w:r>
-        <w:rPr>
-          <w:lang w:val="es-419"/>
-        </w:rPr>
-        <w:t>)  la</w:t>
-      </w:r>
-      <w:proofErr w:type="gramEnd"/>
-      <w:r>
-        <w:rPr>
-          <w:lang w:val="es-419"/>
-        </w:rPr>
-        <w:t xml:space="preserve"> pila   </w:t>
+        <w:t xml:space="preserve">a)  la loma     b)  la laguna     c)  la pila   </w:t>
       </w:r>
     </w:p>
     <w:p>
       <w:pPr>
         <w:spacing w:before="80" w:after="20"/>
-      </w:pPr>
-      <w:r>
-        <w:rPr>
-          <w:b/>
-        </w:rPr>
-        <w:t xml:space="preserve">12.  </w:t>
-      </w:r>
-      <w:r>
-        <w:rPr>
-          <w:b/>
-          <w:u w:val="single"/>
-        </w:rPr>
-        <w:t>Check</w:t>
-      </w:r>
-      <w:r>
-        <w:t xml:space="preserve"> the grease on the combine axle and the tractor oil.</w:t>
-      </w:r>
+        <w:rPr>
+          <w:b/>
+          <w:lang w:val="es-419"/>
+        </w:rPr>
+      </w:pPr>
     </w:p>
     <w:p>
       <w:pPr>
+        <w:spacing w:before="80" w:after="20"/>
+        <w:rPr>
+          <w:b/>
+          <w:lang w:val="es-419"/>
+        </w:rPr>
+      </w:pPr>
+    </w:p>
+    <w:p>
+      <w:pPr>
+        <w:spacing w:before="80" w:after="20"/>
+        <w:rPr>
+          <w:b/>
+          <w:lang w:val="es-419"/>
+        </w:rPr>
+      </w:pPr>
+    </w:p>
+    <w:p>
+      <w:pPr>
+        <w:spacing w:before="80" w:after="20"/>
+      </w:pPr>
+      <w:r>
+        <w:rPr>
+          <w:b/>
+        </w:rPr>
+        <w:t xml:space="preserve">12.  </w:t>
+      </w:r>
+      <w:r>
+        <w:rPr>
+          <w:b/>
+          <w:u w:val="single"/>
+        </w:rPr>
+        <w:t>Check</w:t>
+      </w:r>
+      <w:r>
+        <w:t xml:space="preserve"> the grease on the combine axle and the tractor oil.</w:t>
+      </w:r>
+    </w:p>
+    <w:p>
+      <w:pPr>
         <w:spacing w:before="20" w:after="120"/>
         <w:ind w:left="504"/>
         <w:rPr>
@@ -6759,35 +4567,7 @@
         <w:rPr>
           <w:lang w:val="es-419"/>
         </w:rPr>
-        <w:t xml:space="preserve">a)  verificar     </w:t>
-      </w:r>
-      <w:proofErr w:type="gramStart"/>
-      <w:r>
-        <w:rPr>
-          <w:lang w:val="es-419"/>
-        </w:rPr>
-        <w:t>b)  arreglar</w:t>
-      </w:r>
-      <w:proofErr w:type="gramEnd"/>
-      <w:r>
-        <w:rPr>
-          <w:lang w:val="es-419"/>
-        </w:rPr>
-        <w:t xml:space="preserve">     c</w:t>
-      </w:r>
-      <w:proofErr w:type="gramStart"/>
-      <w:r>
-        <w:rPr>
-          <w:lang w:val="es-419"/>
-        </w:rPr>
-        <w:t>)  encender</w:t>
-      </w:r>
-      <w:proofErr w:type="gramEnd"/>
-      <w:r>
-        <w:rPr>
-          <w:lang w:val="es-419"/>
-        </w:rPr>
-        <w:t xml:space="preserve">   </w:t>
+        <w:t xml:space="preserve">a)  verificar     b)  arreglar     c)  encender   </w:t>
       </w:r>
     </w:p>
     <w:p>
@@ -6829,35 +4609,7 @@
         <w:rPr>
           <w:lang w:val="es-419"/>
         </w:rPr>
-        <w:t xml:space="preserve">a)  aceite     </w:t>
-      </w:r>
-      <w:proofErr w:type="gramStart"/>
-      <w:r>
-        <w:rPr>
-          <w:lang w:val="es-419"/>
-        </w:rPr>
-        <w:t>b)  grasa</w:t>
-      </w:r>
-      <w:proofErr w:type="gramEnd"/>
-      <w:r>
-        <w:rPr>
-          <w:lang w:val="es-419"/>
-        </w:rPr>
-        <w:t xml:space="preserve">     c</w:t>
-      </w:r>
-      <w:proofErr w:type="gramStart"/>
-      <w:r>
-        <w:rPr>
-          <w:lang w:val="es-419"/>
-        </w:rPr>
-        <w:t>)  cinta</w:t>
-      </w:r>
-      <w:proofErr w:type="gramEnd"/>
-      <w:r>
-        <w:rPr>
-          <w:lang w:val="es-419"/>
-        </w:rPr>
-        <w:t xml:space="preserve">   </w:t>
+        <w:t xml:space="preserve">a)  aceite     b)  grasa     c)  cinta   </w:t>
       </w:r>
     </w:p>
     <w:p>
@@ -6899,35 +4651,7 @@
         <w:rPr>
           <w:lang w:val="es-419"/>
         </w:rPr>
-        <w:t xml:space="preserve">a)  empacadora     </w:t>
-      </w:r>
-      <w:proofErr w:type="gramStart"/>
-      <w:r>
-        <w:rPr>
-          <w:lang w:val="es-419"/>
-        </w:rPr>
-        <w:t>b)  cosechadora</w:t>
-      </w:r>
-      <w:proofErr w:type="gramEnd"/>
-      <w:r>
-        <w:rPr>
-          <w:lang w:val="es-419"/>
-        </w:rPr>
-        <w:t xml:space="preserve">     c</w:t>
-      </w:r>
-      <w:proofErr w:type="gramStart"/>
-      <w:r>
-        <w:rPr>
-          <w:lang w:val="es-419"/>
-        </w:rPr>
-        <w:t>)  mezcladora</w:t>
-      </w:r>
-      <w:proofErr w:type="gramEnd"/>
-      <w:r>
-        <w:rPr>
-          <w:lang w:val="es-419"/>
-        </w:rPr>
-        <w:t xml:space="preserve">   </w:t>
+        <w:t xml:space="preserve">a)  empacadora     b)  cosechadora     c)  mezcladora   </w:t>
       </w:r>
     </w:p>
     <w:p>
@@ -6969,35 +4693,7 @@
         <w:rPr>
           <w:lang w:val="es-419"/>
         </w:rPr>
-        <w:t xml:space="preserve">a)  eje     </w:t>
-      </w:r>
-      <w:proofErr w:type="gramStart"/>
-      <w:r>
-        <w:rPr>
-          <w:lang w:val="es-419"/>
-        </w:rPr>
-        <w:t>b)  llanta</w:t>
-      </w:r>
-      <w:proofErr w:type="gramEnd"/>
-      <w:r>
-        <w:rPr>
-          <w:lang w:val="es-419"/>
-        </w:rPr>
-        <w:t xml:space="preserve">     c</w:t>
-      </w:r>
-      <w:proofErr w:type="gramStart"/>
-      <w:r>
-        <w:rPr>
-          <w:lang w:val="es-419"/>
-        </w:rPr>
-        <w:t>)  tuerca</w:t>
-      </w:r>
-      <w:proofErr w:type="gramEnd"/>
-      <w:r>
-        <w:rPr>
-          <w:lang w:val="es-419"/>
-        </w:rPr>
-        <w:t xml:space="preserve">   </w:t>
+        <w:t xml:space="preserve">a)  eje     b)  llanta     c)  tuerca   </w:t>
       </w:r>
     </w:p>
     <w:p>
@@ -7039,35 +4735,7 @@
         <w:rPr>
           <w:lang w:val="es-419"/>
         </w:rPr>
-        <w:t xml:space="preserve">a)  aceite     </w:t>
-      </w:r>
-      <w:proofErr w:type="gramStart"/>
-      <w:r>
-        <w:rPr>
-          <w:lang w:val="es-419"/>
-        </w:rPr>
-        <w:t>b)  grasa</w:t>
-      </w:r>
-      <w:proofErr w:type="gramEnd"/>
-      <w:r>
-        <w:rPr>
-          <w:lang w:val="es-419"/>
-        </w:rPr>
-        <w:t xml:space="preserve">     c</w:t>
-      </w:r>
-      <w:proofErr w:type="gramStart"/>
-      <w:r>
-        <w:rPr>
-          <w:lang w:val="es-419"/>
-        </w:rPr>
-        <w:t>)  agua</w:t>
-      </w:r>
-      <w:proofErr w:type="gramEnd"/>
-      <w:r>
-        <w:rPr>
-          <w:lang w:val="es-419"/>
-        </w:rPr>
-        <w:t xml:space="preserve">   </w:t>
+        <w:t xml:space="preserve">a)  aceite     b)  grasa     c)  agua   </w:t>
       </w:r>
     </w:p>
     <w:p>
@@ -7106,35 +4774,7 @@
         <w:rPr>
           <w:lang w:val="es-419"/>
         </w:rPr>
-        <w:t xml:space="preserve">a)  verificar     </w:t>
-      </w:r>
-      <w:proofErr w:type="gramStart"/>
-      <w:r>
-        <w:rPr>
-          <w:lang w:val="es-419"/>
-        </w:rPr>
-        <w:t>b)  encender</w:t>
-      </w:r>
-      <w:proofErr w:type="gramEnd"/>
-      <w:r>
-        <w:rPr>
-          <w:lang w:val="es-419"/>
-        </w:rPr>
-        <w:t xml:space="preserve">     c</w:t>
-      </w:r>
-      <w:proofErr w:type="gramStart"/>
-      <w:r>
-        <w:rPr>
-          <w:lang w:val="es-419"/>
-        </w:rPr>
-        <w:t>)  arreglar</w:t>
-      </w:r>
-      <w:proofErr w:type="gramEnd"/>
-      <w:r>
-        <w:rPr>
-          <w:lang w:val="es-419"/>
-        </w:rPr>
-        <w:t xml:space="preserve">   </w:t>
+        <w:t xml:space="preserve">a)  verificar     b)  encender     c)  arreglar   </w:t>
       </w:r>
     </w:p>
     <w:p>
@@ -7176,35 +4816,7 @@
         <w:rPr>
           <w:lang w:val="es-419"/>
         </w:rPr>
-        <w:t xml:space="preserve">a)  manguera     </w:t>
-      </w:r>
-      <w:proofErr w:type="gramStart"/>
-      <w:r>
-        <w:rPr>
-          <w:lang w:val="es-419"/>
-        </w:rPr>
-        <w:t>b)  cable</w:t>
-      </w:r>
-      <w:proofErr w:type="gramEnd"/>
-      <w:r>
-        <w:rPr>
-          <w:lang w:val="es-419"/>
-        </w:rPr>
-        <w:t xml:space="preserve">     c</w:t>
-      </w:r>
-      <w:proofErr w:type="gramStart"/>
-      <w:r>
-        <w:rPr>
-          <w:lang w:val="es-419"/>
-        </w:rPr>
-        <w:t>)  cuerda</w:t>
-      </w:r>
-      <w:proofErr w:type="gramEnd"/>
-      <w:r>
-        <w:rPr>
-          <w:lang w:val="es-419"/>
-        </w:rPr>
-        <w:t xml:space="preserve">   </w:t>
+        <w:t xml:space="preserve">a)  manguera     b)  cable     c)  cuerda   </w:t>
       </w:r>
     </w:p>
     <w:p>
@@ -7246,35 +4858,7 @@
         <w:rPr>
           <w:lang w:val="es-419"/>
         </w:rPr>
-        <w:t xml:space="preserve">a)  poste     </w:t>
-      </w:r>
-      <w:proofErr w:type="gramStart"/>
-      <w:r>
-        <w:rPr>
-          <w:lang w:val="es-419"/>
-        </w:rPr>
-        <w:t>b)  carrete</w:t>
-      </w:r>
-      <w:proofErr w:type="gramEnd"/>
-      <w:r>
-        <w:rPr>
-          <w:lang w:val="es-419"/>
-        </w:rPr>
-        <w:t xml:space="preserve">     c</w:t>
-      </w:r>
-      <w:proofErr w:type="gramStart"/>
-      <w:r>
-        <w:rPr>
-          <w:lang w:val="es-419"/>
-        </w:rPr>
-        <w:t>)  eje</w:t>
-      </w:r>
-      <w:proofErr w:type="gramEnd"/>
-      <w:r>
-        <w:rPr>
-          <w:lang w:val="es-419"/>
-        </w:rPr>
-        <w:t xml:space="preserve">   </w:t>
+        <w:t xml:space="preserve">a)  poste     b)  carrete     c)  eje   </w:t>
       </w:r>
     </w:p>
     <w:p>
@@ -7316,14 +4900,7 @@
         <w:rPr>
           <w:lang w:val="es-419"/>
         </w:rPr>
-        <w:t xml:space="preserve">a)  excavadora     </w:t>
-      </w:r>
-      <w:proofErr w:type="gramStart"/>
-      <w:r>
-        <w:rPr>
-          <w:lang w:val="es-419"/>
-        </w:rPr>
-        <w:t xml:space="preserve">b)  </w:t>
+        <w:t xml:space="preserve">a)  excavadora     b)  </w:t>
       </w:r>
       <w:proofErr w:type="spellStart"/>
       <w:r>
@@ -7333,26 +4910,11 @@
         <w:t>minicargadora</w:t>
       </w:r>
       <w:proofErr w:type="spellEnd"/>
-      <w:proofErr w:type="gramEnd"/>
-      <w:r>
-        <w:rPr>
-          <w:lang w:val="es-419"/>
-        </w:rPr>
-        <w:t xml:space="preserve">     c</w:t>
-      </w:r>
-      <w:proofErr w:type="gramStart"/>
-      <w:r>
-        <w:rPr>
-          <w:lang w:val="es-419"/>
-        </w:rPr>
-        <w:t>)  tractor</w:t>
-      </w:r>
-      <w:proofErr w:type="gramEnd"/>
-      <w:r>
-        <w:rPr>
-          <w:lang w:val="es-419"/>
-        </w:rPr>
-        <w:t xml:space="preserve">   </w:t>
+      <w:r>
+        <w:rPr>
+          <w:lang w:val="es-419"/>
+        </w:rPr>
+        <w:t xml:space="preserve">     c)  tractor   </w:t>
       </w:r>
     </w:p>
     <w:p>
@@ -7394,35 +4956,7 @@
         <w:rPr>
           <w:lang w:val="es-419"/>
         </w:rPr>
-        <w:t xml:space="preserve">a)  limpiar     </w:t>
-      </w:r>
-      <w:proofErr w:type="gramStart"/>
-      <w:r>
-        <w:rPr>
-          <w:lang w:val="es-419"/>
-        </w:rPr>
-        <w:t>b)  cavar</w:t>
-      </w:r>
-      <w:proofErr w:type="gramEnd"/>
-      <w:r>
-        <w:rPr>
-          <w:lang w:val="es-419"/>
-        </w:rPr>
-        <w:t xml:space="preserve">     c</w:t>
-      </w:r>
-      <w:proofErr w:type="gramStart"/>
-      <w:r>
-        <w:rPr>
-          <w:lang w:val="es-419"/>
-        </w:rPr>
-        <w:t>)  compactar</w:t>
-      </w:r>
-      <w:proofErr w:type="gramEnd"/>
-      <w:r>
-        <w:rPr>
-          <w:lang w:val="es-419"/>
-        </w:rPr>
-        <w:t xml:space="preserve">   </w:t>
+        <w:t xml:space="preserve">a)  limpiar     b)  cavar     c)  compactar   </w:t>
       </w:r>
     </w:p>
     <w:p>
@@ -7464,35 +4998,7 @@
         <w:rPr>
           <w:lang w:val="es-419"/>
         </w:rPr>
-        <w:t xml:space="preserve">a)  pasillo     </w:t>
-      </w:r>
-      <w:proofErr w:type="gramStart"/>
-      <w:r>
-        <w:rPr>
-          <w:lang w:val="es-419"/>
-        </w:rPr>
-        <w:t>b)  zanja</w:t>
-      </w:r>
-      <w:proofErr w:type="gramEnd"/>
-      <w:r>
-        <w:rPr>
-          <w:lang w:val="es-419"/>
-        </w:rPr>
-        <w:t xml:space="preserve">     c</w:t>
-      </w:r>
-      <w:proofErr w:type="gramStart"/>
-      <w:r>
-        <w:rPr>
-          <w:lang w:val="es-419"/>
-        </w:rPr>
-        <w:t>)  laguna</w:t>
-      </w:r>
-      <w:proofErr w:type="gramEnd"/>
-      <w:r>
-        <w:rPr>
-          <w:lang w:val="es-419"/>
-        </w:rPr>
-        <w:t xml:space="preserve">   </w:t>
+        <w:t xml:space="preserve">a)  pasillo     b)  zanja     c)  laguna   </w:t>
       </w:r>
     </w:p>
     <w:p>
@@ -7602,6 +5108,7 @@
         <w:spacing w:before="80" w:after="20"/>
         <w:rPr>
           <w:b/>
+          <w:lang w:val="es-419"/>
         </w:rPr>
         <w:sectPr>
           <w:type w:val="continuous"/>
@@ -7648,35 +5155,7 @@
         <w:rPr>
           <w:lang w:val="es-419"/>
         </w:rPr>
-        <w:t xml:space="preserve">a)  mover     </w:t>
-      </w:r>
-      <w:proofErr w:type="gramStart"/>
-      <w:r>
-        <w:rPr>
-          <w:lang w:val="es-419"/>
-        </w:rPr>
-        <w:t>b)  amarrar</w:t>
-      </w:r>
-      <w:proofErr w:type="gramEnd"/>
-      <w:r>
-        <w:rPr>
-          <w:lang w:val="es-419"/>
-        </w:rPr>
-        <w:t xml:space="preserve">     c</w:t>
-      </w:r>
-      <w:proofErr w:type="gramStart"/>
-      <w:r>
-        <w:rPr>
-          <w:lang w:val="es-419"/>
-        </w:rPr>
-        <w:t>)  limpiar</w:t>
-      </w:r>
-      <w:proofErr w:type="gramEnd"/>
-      <w:r>
-        <w:rPr>
-          <w:lang w:val="es-419"/>
-        </w:rPr>
-        <w:t xml:space="preserve">   </w:t>
+        <w:t xml:space="preserve">a)  mover     b)  amarrar     c)  limpiar   </w:t>
       </w:r>
     </w:p>
     <w:p>
@@ -7718,35 +5197,7 @@
         <w:rPr>
           <w:lang w:val="es-419"/>
         </w:rPr>
-        <w:t xml:space="preserve">a)  pasillo     </w:t>
-      </w:r>
-      <w:proofErr w:type="gramStart"/>
-      <w:r>
-        <w:rPr>
-          <w:lang w:val="es-419"/>
-        </w:rPr>
-        <w:t>b)  corral</w:t>
-      </w:r>
-      <w:proofErr w:type="gramEnd"/>
-      <w:r>
-        <w:rPr>
-          <w:lang w:val="es-419"/>
-        </w:rPr>
-        <w:t xml:space="preserve">     c</w:t>
-      </w:r>
-      <w:proofErr w:type="gramStart"/>
-      <w:r>
-        <w:rPr>
-          <w:lang w:val="es-419"/>
-        </w:rPr>
-        <w:t>)  establo</w:t>
-      </w:r>
-      <w:proofErr w:type="gramEnd"/>
-      <w:r>
-        <w:rPr>
-          <w:lang w:val="es-419"/>
-        </w:rPr>
-        <w:t xml:space="preserve">   </w:t>
+        <w:t xml:space="preserve">a)  pasillo     b)  corral     c)  establo   </w:t>
       </w:r>
     </w:p>
     <w:p>
@@ -7788,35 +5239,7 @@
         <w:rPr>
           <w:lang w:val="es-419"/>
         </w:rPr>
-        <w:t xml:space="preserve">a)  establo     </w:t>
-      </w:r>
-      <w:proofErr w:type="gramStart"/>
-      <w:r>
-        <w:rPr>
-          <w:lang w:val="es-419"/>
-        </w:rPr>
-        <w:t>b)  laguna</w:t>
-      </w:r>
-      <w:proofErr w:type="gramEnd"/>
-      <w:r>
-        <w:rPr>
-          <w:lang w:val="es-419"/>
-        </w:rPr>
-        <w:t xml:space="preserve">     c</w:t>
-      </w:r>
-      <w:proofErr w:type="gramStart"/>
-      <w:r>
-        <w:rPr>
-          <w:lang w:val="es-419"/>
-        </w:rPr>
-        <w:t>)  hospital</w:t>
-      </w:r>
-      <w:proofErr w:type="gramEnd"/>
-      <w:r>
-        <w:rPr>
-          <w:lang w:val="es-419"/>
-        </w:rPr>
-        <w:t xml:space="preserve">   </w:t>
+        <w:t xml:space="preserve">a)  establo     b)  laguna     c)  hospital   </w:t>
       </w:r>
     </w:p>
     <w:p>
@@ -7858,28 +5281,19 @@
         <w:rPr>
           <w:lang w:val="es-419"/>
         </w:rPr>
-        <w:t xml:space="preserve">a)  excavadora     </w:t>
-      </w:r>
-      <w:proofErr w:type="gramStart"/>
-      <w:r>
-        <w:rPr>
-          <w:lang w:val="es-419"/>
-        </w:rPr>
-        <w:t>b)  cargadora</w:t>
-      </w:r>
-      <w:proofErr w:type="gramEnd"/>
-      <w:r>
-        <w:rPr>
-          <w:lang w:val="es-419"/>
-        </w:rPr>
-        <w:t xml:space="preserve">     c</w:t>
-      </w:r>
-      <w:proofErr w:type="gramStart"/>
-      <w:r>
-        <w:rPr>
-          <w:lang w:val="es-419"/>
-        </w:rPr>
-        <w:t xml:space="preserve">)  </w:t>
+        <w:t xml:space="preserve">a)  excavadora     b)  cargadora     </w:t>
+      </w:r>
+      <w:r>
+        <w:rPr>
+          <w:lang w:val="es-419"/>
+        </w:rPr>
+        <w:br/>
+      </w:r>
+      <w:r>
+        <w:rPr>
+          <w:lang w:val="es-419"/>
+        </w:rPr>
+        <w:t xml:space="preserve">c)  </w:t>
       </w:r>
       <w:proofErr w:type="spellStart"/>
       <w:r>
@@ -7889,7 +5303,6 @@
         <w:t>minicargadora</w:t>
       </w:r>
       <w:proofErr w:type="spellEnd"/>
-      <w:proofErr w:type="gramEnd"/>
       <w:r>
         <w:rPr>
           <w:lang w:val="es-419"/>
@@ -7936,35 +5349,7 @@
         <w:rPr>
           <w:lang w:val="es-419"/>
         </w:rPr>
-        <w:t xml:space="preserve">a)  subir     </w:t>
-      </w:r>
-      <w:proofErr w:type="gramStart"/>
-      <w:r>
-        <w:rPr>
-          <w:lang w:val="es-419"/>
-        </w:rPr>
-        <w:t>b)  mover</w:t>
-      </w:r>
-      <w:proofErr w:type="gramEnd"/>
-      <w:r>
-        <w:rPr>
-          <w:lang w:val="es-419"/>
-        </w:rPr>
-        <w:t xml:space="preserve">     c</w:t>
-      </w:r>
-      <w:proofErr w:type="gramStart"/>
-      <w:r>
-        <w:rPr>
-          <w:lang w:val="es-419"/>
-        </w:rPr>
-        <w:t>)  lavar</w:t>
-      </w:r>
-      <w:proofErr w:type="gramEnd"/>
-      <w:r>
-        <w:rPr>
-          <w:lang w:val="es-419"/>
-        </w:rPr>
-        <w:t xml:space="preserve">   </w:t>
+        <w:t xml:space="preserve">a)  subir     b)  mover     c)  lavar   </w:t>
       </w:r>
     </w:p>
     <w:p>
@@ -8006,60 +5391,41 @@
         <w:rPr>
           <w:lang w:val="es-419"/>
         </w:rPr>
-        <w:t xml:space="preserve">a)  fuerte     </w:t>
-      </w:r>
-      <w:proofErr w:type="gramStart"/>
-      <w:r>
-        <w:rPr>
-          <w:lang w:val="es-419"/>
-        </w:rPr>
-        <w:t>b)  despacio</w:t>
-      </w:r>
-      <w:proofErr w:type="gramEnd"/>
-      <w:r>
-        <w:rPr>
-          <w:lang w:val="es-419"/>
-        </w:rPr>
-        <w:t xml:space="preserve">     c</w:t>
-      </w:r>
-      <w:proofErr w:type="gramStart"/>
-      <w:r>
-        <w:rPr>
-          <w:lang w:val="es-419"/>
-        </w:rPr>
-        <w:t>)  rápido</w:t>
-      </w:r>
-      <w:proofErr w:type="gramEnd"/>
-      <w:r>
-        <w:rPr>
-          <w:lang w:val="es-419"/>
-        </w:rPr>
-        <w:t xml:space="preserve">   </w:t>
+        <w:t xml:space="preserve">a)  fuerte     b)  despacio     c)  rápido   </w:t>
       </w:r>
     </w:p>
     <w:p>
       <w:pPr>
         <w:spacing w:before="80" w:after="20"/>
-      </w:pPr>
-      <w:r>
-        <w:rPr>
-          <w:b/>
-        </w:rPr>
-        <w:t xml:space="preserve">7.  </w:t>
-      </w:r>
-      <w:r>
-        <w:rPr>
-          <w:b/>
-          <w:u w:val="single"/>
-        </w:rPr>
-        <w:t>Give</w:t>
-      </w:r>
-      <w:r>
-        <w:t xml:space="preserve"> the cow the injection and medication for mastitis.</w:t>
-      </w:r>
+        <w:rPr>
+          <w:b/>
+          <w:lang w:val="es-419"/>
+        </w:rPr>
+      </w:pPr>
     </w:p>
     <w:p>
       <w:pPr>
+        <w:spacing w:before="80" w:after="20"/>
+      </w:pPr>
+      <w:r>
+        <w:rPr>
+          <w:b/>
+        </w:rPr>
+        <w:t xml:space="preserve">7.  </w:t>
+      </w:r>
+      <w:r>
+        <w:rPr>
+          <w:b/>
+          <w:u w:val="single"/>
+        </w:rPr>
+        <w:t>Give</w:t>
+      </w:r>
+      <w:r>
+        <w:t xml:space="preserve"> the cow the injection and medication for mastitis.</w:t>
+      </w:r>
+    </w:p>
+    <w:p>
+      <w:pPr>
         <w:spacing w:before="20" w:after="120"/>
         <w:ind w:left="504"/>
         <w:rPr>
@@ -8073,35 +5439,7 @@
         <w:rPr>
           <w:lang w:val="es-419"/>
         </w:rPr>
-        <w:t xml:space="preserve">a)  verificar     </w:t>
-      </w:r>
-      <w:proofErr w:type="gramStart"/>
-      <w:r>
-        <w:rPr>
-          <w:lang w:val="es-419"/>
-        </w:rPr>
-        <w:t>b)  poner</w:t>
-      </w:r>
-      <w:proofErr w:type="gramEnd"/>
-      <w:r>
-        <w:rPr>
-          <w:lang w:val="es-419"/>
-        </w:rPr>
-        <w:t xml:space="preserve">     c</w:t>
-      </w:r>
-      <w:proofErr w:type="gramStart"/>
-      <w:r>
-        <w:rPr>
-          <w:lang w:val="es-419"/>
-        </w:rPr>
-        <w:t>)  dar</w:t>
-      </w:r>
-      <w:proofErr w:type="gramEnd"/>
-      <w:r>
-        <w:rPr>
-          <w:lang w:val="es-419"/>
-        </w:rPr>
-        <w:t xml:space="preserve">   </w:t>
+        <w:t xml:space="preserve">a)  verificar     b)  poner     c)  dar   </w:t>
       </w:r>
     </w:p>
     <w:p>
@@ -8143,35 +5481,7 @@
         <w:rPr>
           <w:lang w:val="es-419"/>
         </w:rPr>
-        <w:t xml:space="preserve">a)  agua     </w:t>
-      </w:r>
-      <w:proofErr w:type="gramStart"/>
-      <w:r>
-        <w:rPr>
-          <w:lang w:val="es-419"/>
-        </w:rPr>
-        <w:t>b)  inyección</w:t>
-      </w:r>
-      <w:proofErr w:type="gramEnd"/>
-      <w:r>
-        <w:rPr>
-          <w:lang w:val="es-419"/>
-        </w:rPr>
-        <w:t xml:space="preserve">     c</w:t>
-      </w:r>
-      <w:proofErr w:type="gramStart"/>
-      <w:r>
-        <w:rPr>
-          <w:lang w:val="es-419"/>
-        </w:rPr>
-        <w:t>)  medicamento</w:t>
-      </w:r>
-      <w:proofErr w:type="gramEnd"/>
-      <w:r>
-        <w:rPr>
-          <w:lang w:val="es-419"/>
-        </w:rPr>
-        <w:t xml:space="preserve">   </w:t>
+        <w:t xml:space="preserve">a)  agua     b)  inyección     c)  medicamento   </w:t>
       </w:r>
     </w:p>
     <w:p>
@@ -8213,35 +5523,7 @@
         <w:rPr>
           <w:lang w:val="es-419"/>
         </w:rPr>
-        <w:t xml:space="preserve">a)  inyección     </w:t>
-      </w:r>
-      <w:proofErr w:type="gramStart"/>
-      <w:r>
-        <w:rPr>
-          <w:lang w:val="es-419"/>
-        </w:rPr>
-        <w:t>b)  agua</w:t>
-      </w:r>
-      <w:proofErr w:type="gramEnd"/>
-      <w:r>
-        <w:rPr>
-          <w:lang w:val="es-419"/>
-        </w:rPr>
-        <w:t xml:space="preserve">     c</w:t>
-      </w:r>
-      <w:proofErr w:type="gramStart"/>
-      <w:r>
-        <w:rPr>
-          <w:lang w:val="es-419"/>
-        </w:rPr>
-        <w:t>)  medicamento</w:t>
-      </w:r>
-      <w:proofErr w:type="gramEnd"/>
-      <w:r>
-        <w:rPr>
-          <w:lang w:val="es-419"/>
-        </w:rPr>
-        <w:t xml:space="preserve">   </w:t>
+        <w:t xml:space="preserve">a)  inyección     b)  agua     c)  medicamento   </w:t>
       </w:r>
     </w:p>
     <w:p>
@@ -8283,35 +5565,7 @@
         <w:rPr>
           <w:lang w:val="es-419"/>
         </w:rPr>
-        <w:t xml:space="preserve">a)  el ordeño     </w:t>
-      </w:r>
-      <w:proofErr w:type="gramStart"/>
-      <w:r>
-        <w:rPr>
-          <w:lang w:val="es-419"/>
-        </w:rPr>
-        <w:t>b)  mastitis</w:t>
-      </w:r>
-      <w:proofErr w:type="gramEnd"/>
-      <w:r>
-        <w:rPr>
-          <w:lang w:val="es-419"/>
-        </w:rPr>
-        <w:t xml:space="preserve">     c</w:t>
-      </w:r>
-      <w:proofErr w:type="gramStart"/>
-      <w:r>
-        <w:rPr>
-          <w:lang w:val="es-419"/>
-        </w:rPr>
-        <w:t>)  la</w:t>
-      </w:r>
-      <w:proofErr w:type="gramEnd"/>
-      <w:r>
-        <w:rPr>
-          <w:lang w:val="es-419"/>
-        </w:rPr>
-        <w:t xml:space="preserve"> cosecha   </w:t>
+        <w:t xml:space="preserve">a)  el ordeño     b)  mastitis     c)  la cosecha   </w:t>
       </w:r>
     </w:p>
     <w:p>
@@ -8353,35 +5607,7 @@
         <w:rPr>
           <w:lang w:val="es-419"/>
         </w:rPr>
-        <w:t xml:space="preserve">a)  medicamento     </w:t>
-      </w:r>
-      <w:proofErr w:type="gramStart"/>
-      <w:r>
-        <w:rPr>
-          <w:lang w:val="es-419"/>
-        </w:rPr>
-        <w:t>b)  agua</w:t>
-      </w:r>
-      <w:proofErr w:type="gramEnd"/>
-      <w:r>
-        <w:rPr>
-          <w:lang w:val="es-419"/>
-        </w:rPr>
-        <w:t xml:space="preserve">     c</w:t>
-      </w:r>
-      <w:proofErr w:type="gramStart"/>
-      <w:r>
-        <w:rPr>
-          <w:lang w:val="es-419"/>
-        </w:rPr>
-        <w:t>)  alimento</w:t>
-      </w:r>
-      <w:proofErr w:type="gramEnd"/>
-      <w:r>
-        <w:rPr>
-          <w:lang w:val="es-419"/>
-        </w:rPr>
-        <w:t xml:space="preserve">   </w:t>
+        <w:t xml:space="preserve">a)  medicamento     b)  agua     c)  alimento   </w:t>
       </w:r>
     </w:p>
     <w:p>
@@ -8423,35 +5649,7 @@
         <w:rPr>
           <w:lang w:val="es-419"/>
         </w:rPr>
-        <w:t xml:space="preserve">a)  leche     </w:t>
-      </w:r>
-      <w:proofErr w:type="gramStart"/>
-      <w:r>
-        <w:rPr>
-          <w:lang w:val="es-419"/>
-        </w:rPr>
-        <w:t>b)  alimento</w:t>
-      </w:r>
-      <w:proofErr w:type="gramEnd"/>
-      <w:r>
-        <w:rPr>
-          <w:lang w:val="es-419"/>
-        </w:rPr>
-        <w:t xml:space="preserve">     c</w:t>
-      </w:r>
-      <w:proofErr w:type="gramStart"/>
-      <w:r>
-        <w:rPr>
-          <w:lang w:val="es-419"/>
-        </w:rPr>
-        <w:t>)  agua</w:t>
-      </w:r>
-      <w:proofErr w:type="gramEnd"/>
-      <w:r>
-        <w:rPr>
-          <w:lang w:val="es-419"/>
-        </w:rPr>
-        <w:t xml:space="preserve">   </w:t>
+        <w:t xml:space="preserve">a)  leche     b)  alimento     c)  agua   </w:t>
       </w:r>
     </w:p>
     <w:p>
@@ -8522,6 +5720,7 @@
                 <w:lang w:val="es-419"/>
               </w:rPr>
             </w:pPr>
+            <w:bookmarkStart w:id="0" w:name="_Hlk239067083"/>
             <w:r>
               <w:rPr>
                 <w:lang w:val="es-419"/>
@@ -8691,16 +5890,14 @@
               <w:rPr>
                 <w:lang w:val="es-419"/>
               </w:rPr>
-              <w:t xml:space="preserve">Dé agua a las vacas en </w:t>
-            </w:r>
-            <w:proofErr w:type="gramStart"/>
+              <w:t>Dé agua a las vacas en los abrevadero</w:t>
+            </w:r>
             <w:r>
               <w:rPr>
                 <w:lang w:val="es-419"/>
               </w:rPr>
-              <w:t>los abrevadero</w:t>
-            </w:r>
-            <w:proofErr w:type="gramEnd"/>
+              <w:t>s</w:t>
+            </w:r>
             <w:r>
               <w:rPr>
                 <w:lang w:val="es-419"/>
@@ -9115,7 +6312,10 @@
               <w:contextualSpacing/>
             </w:pPr>
             <w:r>
-              <w:t>Start the alley scraper to clear manure from the aisles.</w:t>
+              <w:t>Run</w:t>
+            </w:r>
+            <w:r>
+              <w:t xml:space="preserve"> the alley scraper to clear manure from the aisles.</w:t>
             </w:r>
           </w:p>
           <w:p>
@@ -9124,7 +6324,13 @@
               <w:contextualSpacing/>
             </w:pPr>
             <w:r>
-              <w:t>Connect the hose to the spigot and the nozzle to the hose.</w:t>
+              <w:t xml:space="preserve">Connect the hose to the </w:t>
+            </w:r>
+            <w:r>
+              <w:t>faucet</w:t>
+            </w:r>
+            <w:r>
+              <w:t xml:space="preserve"> and the nozzle to the hose.</w:t>
             </w:r>
           </w:p>
           <w:p>
@@ -9142,7 +6348,16 @@
               <w:contextualSpacing/>
             </w:pPr>
             <w:r>
-              <w:t>Dispose of the trash — place the trash bags in the dumpster.</w:t>
+              <w:t>Throw out</w:t>
+            </w:r>
+            <w:r>
+              <w:t xml:space="preserve"> the trash — place the trash bags in the </w:t>
+            </w:r>
+            <w:r>
+              <w:t>trashcan</w:t>
+            </w:r>
+            <w:r>
+              <w:t>.</w:t>
             </w:r>
           </w:p>
           <w:p>
@@ -9151,7 +6366,13 @@
               <w:contextualSpacing/>
             </w:pPr>
             <w:r>
-              <w:t>Use the bucket to clean up the spilled milk in the aisle.</w:t>
+              <w:t xml:space="preserve">Use the bucket to clean up the milk </w:t>
+            </w:r>
+            <w:r>
+              <w:t xml:space="preserve">spill </w:t>
+            </w:r>
+            <w:r>
+              <w:t>in the aisle.</w:t>
             </w:r>
           </w:p>
           <w:p>
@@ -9175,7 +6396,10 @@
               <w:contextualSpacing/>
             </w:pPr>
             <w:r>
-              <w:t>Turn on the mixer to prepare the Total Mixed Ration.</w:t>
+              <w:t>Start</w:t>
+            </w:r>
+            <w:r>
+              <w:t xml:space="preserve"> the mixer to prepare the Total Mixed Ration.</w:t>
             </w:r>
           </w:p>
           <w:p>
@@ -9184,7 +6408,22 @@
               <w:contextualSpacing/>
             </w:pPr>
             <w:r>
-              <w:t>Cut the twine on the bale before placing it in the mixer.</w:t>
+              <w:t xml:space="preserve">Cut the </w:t>
+            </w:r>
+            <w:r>
+              <w:t>string</w:t>
+            </w:r>
+            <w:r>
+              <w:t xml:space="preserve"> on the bale before p</w:t>
+            </w:r>
+            <w:r>
+              <w:t>utt</w:t>
+            </w:r>
+            <w:r>
+              <w:t>i</w:t>
+            </w:r>
+            <w:r>
+              <w:t>ng it in the mixer.</w:t>
             </w:r>
           </w:p>
           <w:p>
@@ -9193,7 +6432,22 @@
               <w:contextualSpacing/>
             </w:pPr>
             <w:r>
-              <w:t>Place the feed in the feed bunk before the cows enter.</w:t>
+              <w:t>Put</w:t>
+            </w:r>
+            <w:r>
+              <w:t xml:space="preserve"> the feed in the </w:t>
+            </w:r>
+            <w:r>
+              <w:t>trough</w:t>
+            </w:r>
+            <w:r>
+              <w:t xml:space="preserve"> before the cows </w:t>
+            </w:r>
+            <w:r>
+              <w:t>come in</w:t>
+            </w:r>
+            <w:r>
+              <w:t>.</w:t>
             </w:r>
           </w:p>
           <w:p>
@@ -9202,7 +6456,10 @@
               <w:contextualSpacing/>
             </w:pPr>
             <w:r>
-              <w:t>Provide water to the cows in the water troughs.</w:t>
+              <w:t>Give the cows</w:t>
+            </w:r>
+            <w:r>
+              <w:t xml:space="preserve"> water in the troughs.</w:t>
             </w:r>
           </w:p>
           <w:p>
@@ -9211,7 +6468,19 @@
               <w:contextualSpacing/>
             </w:pPr>
             <w:r>
-              <w:t>Use the loader truck to transport feed to the far barn.</w:t>
+              <w:t xml:space="preserve">Use the </w:t>
+            </w:r>
+            <w:r>
+              <w:t>t</w:t>
+            </w:r>
+            <w:r>
+              <w:t xml:space="preserve">ruck to </w:t>
+            </w:r>
+            <w:r>
+              <w:t>haul the</w:t>
+            </w:r>
+            <w:r>
+              <w:t xml:space="preserve"> feed to the far barn.</w:t>
             </w:r>
           </w:p>
           <w:p>
@@ -9220,7 +6489,19 @@
               <w:contextualSpacing/>
             </w:pPr>
             <w:r>
-              <w:t>Load the hay bales onto the trailer before it rains.</w:t>
+              <w:t xml:space="preserve">Load the hay bales onto the </w:t>
+            </w:r>
+            <w:r>
+              <w:t>wagon</w:t>
+            </w:r>
+            <w:r>
+              <w:t xml:space="preserve"> before </w:t>
+            </w:r>
+            <w:r>
+              <w:t xml:space="preserve">the </w:t>
+            </w:r>
+            <w:r>
+              <w:t>rain.</w:t>
             </w:r>
           </w:p>
           <w:p>
@@ -9234,6 +6515,9 @@
               <w:spacing w:after="120"/>
               <w:contextualSpacing/>
             </w:pPr>
+            <w:r>
+              <w:t>=== Scenario 3 · Fence Repair ===</w:t>
+            </w:r>
           </w:p>
           <w:p>
             <w:pPr>
@@ -9241,7 +6525,7 @@
               <w:contextualSpacing/>
             </w:pPr>
             <w:r>
-              <w:t>=== Scenario 3 · Fence Repair ===</w:t>
+              <w:t>Use the hammer to fix the broken gate post.</w:t>
             </w:r>
           </w:p>
           <w:p>
@@ -9250,7 +6534,7 @@
               <w:contextualSpacing/>
             </w:pPr>
             <w:r>
-              <w:t>Use the hammer to fix the broken gate post.</w:t>
+              <w:t>Use the screwdriver to tighten the loose screw on the gate hinge.</w:t>
             </w:r>
           </w:p>
           <w:p>
@@ -9259,7 +6543,7 @@
               <w:contextualSpacing/>
             </w:pPr>
             <w:r>
-              <w:t>Use the screwdriver to tighten the loose screw on the gate hinge.</w:t>
+              <w:t>Use the nail gun to fasten the boards to the fence frame.</w:t>
             </w:r>
           </w:p>
           <w:p>
@@ -9268,7 +6552,19 @@
               <w:contextualSpacing/>
             </w:pPr>
             <w:r>
-              <w:t>Use the nail gun to fasten the boards to the fence frame.</w:t>
+              <w:t xml:space="preserve">Use </w:t>
+            </w:r>
+            <w:r>
+              <w:t xml:space="preserve">the </w:t>
+            </w:r>
+            <w:r>
+              <w:t xml:space="preserve">staples to </w:t>
+            </w:r>
+            <w:r>
+              <w:t>attach</w:t>
+            </w:r>
+            <w:r>
+              <w:t xml:space="preserve"> the wire to the fence posts.</w:t>
             </w:r>
           </w:p>
           <w:p>
@@ -9277,7 +6573,16 @@
               <w:contextualSpacing/>
             </w:pPr>
             <w:r>
-              <w:t>Use fence staples to secure the wire to the fence posts.</w:t>
+              <w:t xml:space="preserve">Tie </w:t>
+            </w:r>
+            <w:r>
+              <w:t xml:space="preserve">the gate with </w:t>
+            </w:r>
+            <w:r>
+              <w:t>the</w:t>
+            </w:r>
+            <w:r>
+              <w:t xml:space="preserve"> chain until we get a new latch.</w:t>
             </w:r>
           </w:p>
           <w:p>
@@ -9286,7 +6591,13 @@
               <w:contextualSpacing/>
             </w:pPr>
             <w:r>
-              <w:t>Secure the gate with a chain until we get a new latch.</w:t>
+              <w:t xml:space="preserve">Use </w:t>
+            </w:r>
+            <w:r>
+              <w:t xml:space="preserve">the </w:t>
+            </w:r>
+            <w:r>
+              <w:t>wire to close the gap in the fence.</w:t>
             </w:r>
           </w:p>
           <w:p>
@@ -9294,15 +6605,15 @@
               <w:spacing w:after="120"/>
               <w:contextualSpacing/>
             </w:pPr>
-            <w:r>
-              <w:t>Use wire to close the gap in the fence.</w:t>
-            </w:r>
           </w:p>
           <w:p>
             <w:pPr>
               <w:spacing w:after="120"/>
               <w:contextualSpacing/>
             </w:pPr>
+            <w:r>
+              <w:t>=== Scenario 4 · Field and Equipment ===</w:t>
+            </w:r>
           </w:p>
           <w:p>
             <w:pPr>
@@ -9310,7 +6621,16 @@
               <w:contextualSpacing/>
             </w:pPr>
             <w:r>
-              <w:t>=== Scenario 4 · Field and Equipment ===</w:t>
+              <w:t xml:space="preserve">Run </w:t>
+            </w:r>
+            <w:r>
+              <w:t xml:space="preserve">the chopper to </w:t>
+            </w:r>
+            <w:r>
+              <w:t>cut the</w:t>
+            </w:r>
+            <w:r>
+              <w:t xml:space="preserve"> corn for silage.</w:t>
             </w:r>
           </w:p>
           <w:p>
@@ -9319,7 +6639,19 @@
               <w:contextualSpacing/>
             </w:pPr>
             <w:r>
-              <w:t>Start the chopper to harvest corn for silage.</w:t>
+              <w:t xml:space="preserve">Drive the tractor to </w:t>
+            </w:r>
+            <w:r>
+              <w:t>compact</w:t>
+            </w:r>
+            <w:r>
+              <w:t xml:space="preserve"> the silage in the </w:t>
+            </w:r>
+            <w:r>
+              <w:t>bunker</w:t>
+            </w:r>
+            <w:r>
+              <w:t>.</w:t>
             </w:r>
           </w:p>
           <w:p>
@@ -9328,7 +6660,25 @@
               <w:contextualSpacing/>
             </w:pPr>
             <w:r>
-              <w:t>Drive the tractor to pack down the silage in the pile.</w:t>
+              <w:t>P</w:t>
+            </w:r>
+            <w:r>
+              <w:t>ut</w:t>
+            </w:r>
+            <w:r>
+              <w:t xml:space="preserve"> </w:t>
+            </w:r>
+            <w:r>
+              <w:t xml:space="preserve">the </w:t>
+            </w:r>
+            <w:r>
+              <w:t xml:space="preserve">tires on the </w:t>
+            </w:r>
+            <w:r>
+              <w:t>tarp over the bunker</w:t>
+            </w:r>
+            <w:r>
+              <w:t>.</w:t>
             </w:r>
           </w:p>
           <w:p>
@@ -9337,7 +6687,19 @@
               <w:contextualSpacing/>
             </w:pPr>
             <w:r>
-              <w:t>Place tires on the mound atop the silage pile.</w:t>
+              <w:t xml:space="preserve">Check the grease on the </w:t>
+            </w:r>
+            <w:r>
+              <w:t>combine</w:t>
+            </w:r>
+            <w:r>
+              <w:t xml:space="preserve"> axle and the tractor</w:t>
+            </w:r>
+            <w:r>
+              <w:t xml:space="preserve"> oil</w:t>
+            </w:r>
+            <w:r>
+              <w:t>.</w:t>
             </w:r>
           </w:p>
           <w:p>
@@ -9346,7 +6708,19 @@
               <w:contextualSpacing/>
             </w:pPr>
             <w:r>
-              <w:t>Check the grease on the harvester's axle and the oil in the tractor.</w:t>
+              <w:t>Fix</w:t>
+            </w:r>
+            <w:r>
+              <w:t xml:space="preserve"> the cable on the </w:t>
+            </w:r>
+            <w:r>
+              <w:t xml:space="preserve">reel of the </w:t>
+            </w:r>
+            <w:r>
+              <w:t>alley scraper</w:t>
+            </w:r>
+            <w:r>
+              <w:t>.</w:t>
             </w:r>
           </w:p>
           <w:p>
@@ -9355,7 +6729,13 @@
               <w:contextualSpacing/>
             </w:pPr>
             <w:r>
-              <w:t>Repair the cable on the alley scraper's winch.</w:t>
+              <w:t xml:space="preserve">Use the </w:t>
+            </w:r>
+            <w:r>
+              <w:t>backhoe</w:t>
+            </w:r>
+            <w:r>
+              <w:t xml:space="preserve"> to dig the drainage ditch.</w:t>
             </w:r>
           </w:p>
           <w:p>
@@ -9363,15 +6743,15 @@
               <w:spacing w:after="120"/>
               <w:contextualSpacing/>
             </w:pPr>
-            <w:r>
-              <w:t>Use the excavator to dig the drainage ditch.</w:t>
-            </w:r>
           </w:p>
           <w:p>
             <w:pPr>
               <w:spacing w:after="120"/>
               <w:contextualSpacing/>
             </w:pPr>
+            <w:r>
+              <w:t>=== Scenario 5 · Sick Cow / Hospital ===</w:t>
+            </w:r>
           </w:p>
           <w:p>
             <w:pPr>
@@ -9379,7 +6759,13 @@
               <w:contextualSpacing/>
             </w:pPr>
             <w:r>
-              <w:t>=== Scenario 5 · Sick Cow / Hospital ===</w:t>
+              <w:t xml:space="preserve">Move the sick cow from her </w:t>
+            </w:r>
+            <w:r>
+              <w:t>stall</w:t>
+            </w:r>
+            <w:r>
+              <w:t xml:space="preserve"> to the hospital. </w:t>
             </w:r>
           </w:p>
           <w:p>
@@ -9388,7 +6774,13 @@
               <w:contextualSpacing/>
             </w:pPr>
             <w:r>
-              <w:t xml:space="preserve">Move the sick cow from her pen to the hospital. </w:t>
+              <w:t xml:space="preserve">Use the skid steer to lift and move the cow </w:t>
+            </w:r>
+            <w:r>
+              <w:t xml:space="preserve">slowly </w:t>
+            </w:r>
+            <w:r>
+              <w:t>to the hospital area.</w:t>
             </w:r>
           </w:p>
           <w:p>
@@ -9397,7 +6789,10 @@
               <w:contextualSpacing/>
             </w:pPr>
             <w:r>
-              <w:t>Use the skid steer to lift and slowly move the cow to the hospital area.</w:t>
+              <w:t xml:space="preserve">Give the cow </w:t>
+            </w:r>
+            <w:r>
+              <w:t>the injection and medication for mastitis.</w:t>
             </w:r>
           </w:p>
           <w:p>
@@ -9406,20 +6801,15 @@
               <w:contextualSpacing/>
             </w:pPr>
             <w:r>
-              <w:t>Administer the injection and the medication for mastitis to the cow.</w:t>
-            </w:r>
-          </w:p>
-          <w:p>
-            <w:pPr>
-              <w:spacing w:after="120"/>
-              <w:contextualSpacing/>
-            </w:pPr>
-            <w:r>
-              <w:t>Provide the cow with feed and water within easy reach of her head.</w:t>
+              <w:t xml:space="preserve">Give </w:t>
+            </w:r>
+            <w:r>
+              <w:t>the cow feed and water within reach of her head.</w:t>
             </w:r>
           </w:p>
         </w:tc>
       </w:tr>
+      <w:bookmarkEnd w:id="0"/>
     </w:tbl>
     <w:p>
       <w:pPr>
@@ -9433,14 +6823,12 @@
         <w:rPr>
           <w:b/>
           <w:sz w:val="28"/>
-          <w:lang w:val="es-419"/>
         </w:rPr>
       </w:pPr>
       <w:r>
         <w:rPr>
           <w:b/>
           <w:sz w:val="28"/>
-          <w:lang w:val="es-419"/>
         </w:rPr>
         <w:br w:type="page"/>
       </w:r>

</xml_diff>